<commit_message>
Fill out the export showcase and link each format from the package README
The six showcase documents now read like a real handbook: seven endpoints
with parameter and response tables and JSON samples, request samples in
curl, Node.js and Python, a conditional-request example, request costs,
plan changes, an error catalogue with a handling sample, and four dated
releases with an upcoming-changes table. Sections flow within a document
instead of each starting a new page, so the bound volume is twenty-eight
filled pages rather than twenty-six mostly empty ones, and date columns
have a minimum width so they do not wrap.

The cudoc-export README gains a table that links one document and the
bound volume in every format, and the export guide describes the sample
as it now is.
</commit_message>
<xml_diff>
--- a/examples/export/showcase-output/getting-started.docx
+++ b/examples/export/showcase-output/getting-started.docx
@@ -23,7 +23,7 @@
         <w:autoSpaceDN/>
       </w:pPr>
       <w:r>
-        <w:t xml:space="preserve">Three steps take you from nothing to a first forecast. The whole flow is one HTTPS request with a key in a header; there is no SDK to install.</w:t>
+        <w:t xml:space="preserve">Four steps take you from nothing to a first forecast in production: a key, a request, a look at the response, and a polling schedule that respects the cache. The whole flow is plain HTTPS with a key in a header; there is no SDK to install, and any HTTP client will do.</w:t>
       </w:r>
     </w:p>
     <w:p>
@@ -76,7 +76,6 @@
     <w:p>
       <w:pPr>
         <w:pStyle w:val="Heading2"/>
-        <w:pageBreakBefore/>
         <w:overflowPunct/>
         <w:autoSpaceDN/>
       </w:pPr>
@@ -93,20 +92,8 @@
         <w:autoSpaceDN/>
       </w:pPr>
       <w:r>
-        <w:t xml:space="preserve">Keys are issued per project and scoped to the stations a project may read.</w:t>
-      </w:r>
-    </w:p>
-    <w:p>
-      <w:pPr>
-        <w:pStyle w:val="Heading5"/>
-        <w:overflowPunct/>
-        <w:autoSpaceDN/>
-      </w:pPr>
-      <w:bookmarkStart w:name="cudoct4ascbtbiB1ftkSgcdzzSDXCTw" w:id="4"/>
-      <w:r>
-        <w:t xml:space="preserve">Requirements</w:t>
-      </w:r>
-      <w:bookmarkEnd w:id="4"/>
+        <w:t xml:space="preserve">Keys are issued per project and scoped to the stations a project may read. A project is created in the Northlight console, and every key it issues carries the project's plan and its station list. Two kinds of key exist:</w:t>
+      </w:r>
     </w:p>
     <w:tbl>
       <w:tblPr>
@@ -155,14 +142,14 @@
               <w:autoSpaceDN/>
             </w:pPr>
             <w:r>
-              <w:t xml:space="preserve">Step</w:t>
+              <w:t xml:space="preserve">Kind</w:t>
             </w:r>
           </w:p>
         </w:tc>
         <w:tc>
           <w:tcPr>
-            <w:tcW w:type="dxa" w:w="6424"/>
-            <w:gridSpan w:val="2"/>
+            <w:tcW w:type="dxa" w:w="3212"/>
+            <w:gridSpan w:val="1"/>
             <w:tcBorders>
               <w:top w:val="none" w:color="auto" w:sz="0"/>
               <w:left w:val="none" w:color="auto" w:sz="0"/>
@@ -184,7 +171,36 @@
               <w:autoSpaceDN/>
             </w:pPr>
             <w:r>
-              <w:t xml:space="preserve">Prerequisites</w:t>
+              <w:t xml:space="preserve">Prefix</w:t>
+            </w:r>
+          </w:p>
+        </w:tc>
+        <w:tc>
+          <w:tcPr>
+            <w:tcW w:type="dxa" w:w="3212"/>
+            <w:gridSpan w:val="1"/>
+            <w:tcBorders>
+              <w:top w:val="none" w:color="auto" w:sz="0"/>
+              <w:left w:val="none" w:color="auto" w:sz="0"/>
+              <w:bottom w:val="single" w:color="E2E8F0" w:sz="4"/>
+              <w:right w:val="none" w:color="auto" w:sz="0"/>
+            </w:tcBorders>
+            <w:tcMar>
+              <w:top w:type="dxa" w:w="105"/>
+              <w:left w:type="dxa" w:w="158"/>
+              <w:bottom w:type="dxa" w:w="105"/>
+              <w:right w:type="dxa" w:w="158"/>
+            </w:tcMar>
+            <w:vAlign w:val="top"/>
+          </w:tcPr>
+          <w:p>
+            <w:pPr>
+              <w:pStyle w:val="CudocTableHeader"/>
+              <w:overflowPunct/>
+              <w:autoSpaceDN/>
+            </w:pPr>
+            <w:r>
+              <w:t xml:space="preserve">Purpose</w:t>
             </w:r>
           </w:p>
         </w:tc>
@@ -219,7 +235,7 @@
               <w:autoSpaceDN/>
             </w:pPr>
             <w:r>
-              <w:t xml:space="preserve">Register</w:t>
+              <w:t xml:space="preserve">Live</w:t>
             </w:r>
           </w:p>
         </w:tc>
@@ -244,43 +260,14 @@
           <w:p>
             <w:pPr>
               <w:pStyle w:val="CudocTableCell"/>
-              <w:numPr>
-                <w:ilvl w:val="0"/>
-                <w:numId w:val="2"/>
-              </w:numPr>
               <w:overflowPunct/>
               <w:autoSpaceDN/>
             </w:pPr>
             <w:r>
-              <w:t xml:space="preserve">A project name</w:t>
-            </w:r>
-          </w:p>
-          <w:p>
-            <w:pPr>
-              <w:pStyle w:val="CudocTableCell"/>
-              <w:numPr>
-                <w:ilvl w:val="0"/>
-                <w:numId w:val="2"/>
-              </w:numPr>
-              <w:overflowPunct/>
-              <w:autoSpaceDN/>
-            </w:pPr>
-            <w:r>
-              <w:t xml:space="preserve">A billing contact</w:t>
-            </w:r>
-          </w:p>
-          <w:p>
-            <w:pPr>
-              <w:pStyle w:val="CudocTableCell"/>
-              <w:numPr>
-                <w:ilvl w:val="0"/>
-                <w:numId w:val="2"/>
-              </w:numPr>
-              <w:overflowPunct/>
-              <w:autoSpaceDN/>
-            </w:pPr>
-            <w:r>
-              <w:t xml:space="preserve">At least one station</w:t>
+              <w:rPr>
+                <w:rStyle w:val="CudocCode"/>
+              </w:rPr>
+              <w:t xml:space="preserve">nlk_live_</w:t>
             </w:r>
           </w:p>
         </w:tc>
@@ -305,29 +292,11 @@
           <w:p>
             <w:pPr>
               <w:pStyle w:val="CudocTableCell"/>
-              <w:numPr>
-                <w:ilvl w:val="0"/>
-                <w:numId w:val="3"/>
-              </w:numPr>
               <w:overflowPunct/>
               <w:autoSpaceDN/>
             </w:pPr>
             <w:r>
-              <w:t xml:space="preserve">Accepted terms</w:t>
-            </w:r>
-          </w:p>
-          <w:p>
-            <w:pPr>
-              <w:pStyle w:val="CudocTableCell"/>
-              <w:numPr>
-                <w:ilvl w:val="0"/>
-                <w:numId w:val="3"/>
-              </w:numPr>
-              <w:overflowPunct/>
-              <w:autoSpaceDN/>
-            </w:pPr>
-            <w:r>
-              <w:t xml:space="preserve">A callback URL</w:t>
+              <w:t xml:space="preserve">Reads real stations and counts against the project's plan.</w:t>
             </w:r>
           </w:p>
         </w:tc>
@@ -363,7 +332,164 @@
               <w:autoSpaceDN/>
             </w:pPr>
             <w:r>
-              <w:t xml:space="preserve">Rotate</w:t>
+              <w:t xml:space="preserve">Test</w:t>
+            </w:r>
+          </w:p>
+        </w:tc>
+        <w:tc>
+          <w:tcPr>
+            <w:tcW w:type="dxa" w:w="3212"/>
+            <w:gridSpan w:val="1"/>
+            <w:tcBorders>
+              <w:top w:val="none" w:color="auto" w:sz="0"/>
+              <w:left w:val="none" w:color="auto" w:sz="0"/>
+              <w:bottom w:val="none" w:color="auto" w:sz="0"/>
+              <w:right w:val="none" w:color="auto" w:sz="0"/>
+            </w:tcBorders>
+            <w:shd w:fill="FAFBFD" w:val="clear"/>
+            <w:tcMar>
+              <w:top w:type="dxa" w:w="105"/>
+              <w:left w:type="dxa" w:w="158"/>
+              <w:bottom w:type="dxa" w:w="105"/>
+              <w:right w:type="dxa" w:w="158"/>
+            </w:tcMar>
+            <w:vAlign w:val="top"/>
+          </w:tcPr>
+          <w:p>
+            <w:pPr>
+              <w:pStyle w:val="CudocTableCell"/>
+              <w:overflowPunct/>
+              <w:autoSpaceDN/>
+            </w:pPr>
+            <w:r>
+              <w:rPr>
+                <w:rStyle w:val="CudocCode"/>
+              </w:rPr>
+              <w:t xml:space="preserve">nlk_test_</w:t>
+            </w:r>
+          </w:p>
+        </w:tc>
+        <w:tc>
+          <w:tcPr>
+            <w:tcW w:type="dxa" w:w="3212"/>
+            <w:gridSpan w:val="1"/>
+            <w:tcBorders>
+              <w:top w:val="none" w:color="auto" w:sz="0"/>
+              <w:left w:val="none" w:color="auto" w:sz="0"/>
+              <w:bottom w:val="none" w:color="auto" w:sz="0"/>
+              <w:right w:val="none" w:color="auto" w:sz="0"/>
+            </w:tcBorders>
+            <w:shd w:fill="FAFBFD" w:val="clear"/>
+            <w:tcMar>
+              <w:top w:type="dxa" w:w="105"/>
+              <w:left w:type="dxa" w:w="158"/>
+              <w:bottom w:type="dxa" w:w="105"/>
+              <w:right w:type="dxa" w:w="158"/>
+            </w:tcMar>
+            <w:vAlign w:val="top"/>
+          </w:tcPr>
+          <w:p>
+            <w:pPr>
+              <w:pStyle w:val="CudocTableCell"/>
+              <w:overflowPunct/>
+              <w:autoSpaceDN/>
+            </w:pPr>
+            <w:r>
+              <w:t xml:space="preserve">Reads the synthetic station </w:t>
+            </w:r>
+            <w:r>
+              <w:rPr>
+                <w:rStyle w:val="CudocCode"/>
+              </w:rPr>
+              <w:t xml:space="preserve">TEST-01</w:t>
+            </w:r>
+            <w:r>
+              <w:t xml:space="preserve"> only, returns fixed data and is never rate limited.</w:t>
+            </w:r>
+          </w:p>
+        </w:tc>
+      </w:tr>
+    </w:tbl>
+    <w:p>
+      <w:pPr>
+        <w:pStyle w:val="CudocBody"/>
+        <w:overflowPunct/>
+        <w:spacing w:before="210"/>
+        <w:autoSpaceDN/>
+      </w:pPr>
+      <w:r>
+        <w:t xml:space="preserve">Start with a test key. </w:t>
+      </w:r>
+      <w:r>
+        <w:rPr>
+          <w:rStyle w:val="CudocCode"/>
+        </w:rPr>
+        <w:t xml:space="preserve">TEST-01</w:t>
+      </w:r>
+      <w:r>
+        <w:t xml:space="preserve"> reports the same reading every ten minutes and a forecast that is always 12 °C and calm, so your parser can be checked against known values before a live key is involved.</w:t>
+      </w:r>
+    </w:p>
+    <w:p>
+      <w:pPr>
+        <w:pStyle w:val="Heading5"/>
+        <w:overflowPunct/>
+        <w:autoSpaceDN/>
+      </w:pPr>
+      <w:bookmarkStart w:name="cudoct4ascbtbiB1ftkSgcdzzSDXCTw" w:id="4"/>
+      <w:r>
+        <w:t xml:space="preserve">Requirements</w:t>
+      </w:r>
+      <w:bookmarkEnd w:id="4"/>
+    </w:p>
+    <w:tbl>
+      <w:tblPr>
+        <w:tblW w:type="pct" w:w="100%"/>
+        <w:tblBorders>
+          <w:top w:val="single" w:color="E2E8F0" w:sz="4"/>
+          <w:left w:val="none" w:color="auto" w:sz="0"/>
+          <w:bottom w:val="single" w:color="E2E8F0" w:sz="4"/>
+          <w:right w:val="none" w:color="auto" w:sz="0"/>
+          <w:insideH w:val="none" w:color="auto" w:sz="0"/>
+          <w:insideV w:val="none" w:color="auto" w:sz="0"/>
+        </w:tblBorders>
+      </w:tblPr>
+      <w:tblGrid>
+        <w:gridCol w:w="3212"/>
+        <w:gridCol w:w="3212"/>
+        <w:gridCol w:w="3212"/>
+      </w:tblGrid>
+      <w:tr>
+        <w:trPr>
+          <w:cantSplit/>
+          <w:tblHeader/>
+        </w:trPr>
+        <w:tc>
+          <w:tcPr>
+            <w:tcW w:type="dxa" w:w="3212"/>
+            <w:gridSpan w:val="1"/>
+            <w:tcBorders>
+              <w:top w:val="none" w:color="auto" w:sz="0"/>
+              <w:left w:val="none" w:color="auto" w:sz="0"/>
+              <w:bottom w:val="single" w:color="E2E8F0" w:sz="4"/>
+              <w:right w:val="none" w:color="auto" w:sz="0"/>
+            </w:tcBorders>
+            <w:tcMar>
+              <w:top w:type="dxa" w:w="105"/>
+              <w:left w:type="dxa" w:w="158"/>
+              <w:bottom w:type="dxa" w:w="105"/>
+              <w:right w:type="dxa" w:w="158"/>
+            </w:tcMar>
+            <w:vAlign w:val="top"/>
+          </w:tcPr>
+          <w:p>
+            <w:pPr>
+              <w:pStyle w:val="CudocTableHeader"/>
+              <w:overflowPunct/>
+              <w:autoSpaceDN/>
+            </w:pPr>
+            <w:r>
+              <w:t xml:space="preserve">Step</w:t>
             </w:r>
           </w:p>
         </w:tc>
@@ -374,7 +500,215 @@
             <w:tcBorders>
               <w:top w:val="none" w:color="auto" w:sz="0"/>
               <w:left w:val="none" w:color="auto" w:sz="0"/>
-              <w:bottom w:val="none" w:color="auto" w:sz="0"/>
+              <w:bottom w:val="single" w:color="E2E8F0" w:sz="4"/>
+              <w:right w:val="none" w:color="auto" w:sz="0"/>
+            </w:tcBorders>
+            <w:tcMar>
+              <w:top w:type="dxa" w:w="105"/>
+              <w:left w:type="dxa" w:w="158"/>
+              <w:bottom w:type="dxa" w:w="105"/>
+              <w:right w:type="dxa" w:w="158"/>
+            </w:tcMar>
+            <w:vAlign w:val="top"/>
+          </w:tcPr>
+          <w:p>
+            <w:pPr>
+              <w:pStyle w:val="CudocTableHeader"/>
+              <w:overflowPunct/>
+              <w:autoSpaceDN/>
+            </w:pPr>
+            <w:r>
+              <w:t xml:space="preserve">Prerequisites</w:t>
+            </w:r>
+          </w:p>
+        </w:tc>
+      </w:tr>
+      <w:tr>
+        <w:trPr>
+          <w:cantSplit/>
+          <w:tblHeader w:val="false"/>
+        </w:trPr>
+        <w:tc>
+          <w:tcPr>
+            <w:tcW w:type="dxa" w:w="3212"/>
+            <w:gridSpan w:val="1"/>
+            <w:tcBorders>
+              <w:top w:val="none" w:color="auto" w:sz="0"/>
+              <w:left w:val="none" w:color="auto" w:sz="0"/>
+              <w:bottom w:val="single" w:color="EEF2F7" w:sz="4"/>
+              <w:right w:val="none" w:color="auto" w:sz="0"/>
+            </w:tcBorders>
+            <w:tcMar>
+              <w:top w:type="dxa" w:w="105"/>
+              <w:left w:type="dxa" w:w="158"/>
+              <w:bottom w:type="dxa" w:w="105"/>
+              <w:right w:type="dxa" w:w="158"/>
+            </w:tcMar>
+            <w:vAlign w:val="top"/>
+          </w:tcPr>
+          <w:p>
+            <w:pPr>
+              <w:pStyle w:val="CudocTableCell"/>
+              <w:overflowPunct/>
+              <w:autoSpaceDN/>
+            </w:pPr>
+            <w:r>
+              <w:t xml:space="preserve">Register</w:t>
+            </w:r>
+          </w:p>
+        </w:tc>
+        <w:tc>
+          <w:tcPr>
+            <w:tcW w:type="dxa" w:w="3212"/>
+            <w:gridSpan w:val="1"/>
+            <w:tcBorders>
+              <w:top w:val="none" w:color="auto" w:sz="0"/>
+              <w:left w:val="none" w:color="auto" w:sz="0"/>
+              <w:bottom w:val="single" w:color="EEF2F7" w:sz="4"/>
+              <w:right w:val="none" w:color="auto" w:sz="0"/>
+            </w:tcBorders>
+            <w:tcMar>
+              <w:top w:type="dxa" w:w="105"/>
+              <w:left w:type="dxa" w:w="158"/>
+              <w:bottom w:type="dxa" w:w="105"/>
+              <w:right w:type="dxa" w:w="158"/>
+            </w:tcMar>
+            <w:vAlign w:val="top"/>
+          </w:tcPr>
+          <w:p>
+            <w:pPr>
+              <w:pStyle w:val="CudocTableCell"/>
+              <w:numPr>
+                <w:ilvl w:val="0"/>
+                <w:numId w:val="2"/>
+              </w:numPr>
+              <w:overflowPunct/>
+              <w:autoSpaceDN/>
+            </w:pPr>
+            <w:r>
+              <w:t xml:space="preserve">A project name</w:t>
+            </w:r>
+          </w:p>
+          <w:p>
+            <w:pPr>
+              <w:pStyle w:val="CudocTableCell"/>
+              <w:numPr>
+                <w:ilvl w:val="0"/>
+                <w:numId w:val="2"/>
+              </w:numPr>
+              <w:overflowPunct/>
+              <w:autoSpaceDN/>
+            </w:pPr>
+            <w:r>
+              <w:t xml:space="preserve">A billing contact</w:t>
+            </w:r>
+          </w:p>
+          <w:p>
+            <w:pPr>
+              <w:pStyle w:val="CudocTableCell"/>
+              <w:numPr>
+                <w:ilvl w:val="0"/>
+                <w:numId w:val="2"/>
+              </w:numPr>
+              <w:overflowPunct/>
+              <w:autoSpaceDN/>
+            </w:pPr>
+            <w:r>
+              <w:t xml:space="preserve">At least one station</w:t>
+            </w:r>
+          </w:p>
+        </w:tc>
+        <w:tc>
+          <w:tcPr>
+            <w:tcW w:type="dxa" w:w="3212"/>
+            <w:gridSpan w:val="1"/>
+            <w:tcBorders>
+              <w:top w:val="none" w:color="auto" w:sz="0"/>
+              <w:left w:val="none" w:color="auto" w:sz="0"/>
+              <w:bottom w:val="single" w:color="EEF2F7" w:sz="4"/>
+              <w:right w:val="none" w:color="auto" w:sz="0"/>
+            </w:tcBorders>
+            <w:tcMar>
+              <w:top w:type="dxa" w:w="105"/>
+              <w:left w:type="dxa" w:w="158"/>
+              <w:bottom w:type="dxa" w:w="105"/>
+              <w:right w:type="dxa" w:w="158"/>
+            </w:tcMar>
+            <w:vAlign w:val="top"/>
+          </w:tcPr>
+          <w:p>
+            <w:pPr>
+              <w:pStyle w:val="CudocTableCell"/>
+              <w:numPr>
+                <w:ilvl w:val="0"/>
+                <w:numId w:val="3"/>
+              </w:numPr>
+              <w:overflowPunct/>
+              <w:autoSpaceDN/>
+            </w:pPr>
+            <w:r>
+              <w:t xml:space="preserve">Accepted terms</w:t>
+            </w:r>
+          </w:p>
+          <w:p>
+            <w:pPr>
+              <w:pStyle w:val="CudocTableCell"/>
+              <w:numPr>
+                <w:ilvl w:val="0"/>
+                <w:numId w:val="3"/>
+              </w:numPr>
+              <w:overflowPunct/>
+              <w:autoSpaceDN/>
+            </w:pPr>
+            <w:r>
+              <w:t xml:space="preserve">A callback URL</w:t>
+            </w:r>
+          </w:p>
+        </w:tc>
+      </w:tr>
+      <w:tr>
+        <w:trPr>
+          <w:cantSplit/>
+          <w:tblHeader w:val="false"/>
+        </w:trPr>
+        <w:tc>
+          <w:tcPr>
+            <w:tcW w:type="dxa" w:w="3212"/>
+            <w:gridSpan w:val="1"/>
+            <w:tcBorders>
+              <w:top w:val="none" w:color="auto" w:sz="0"/>
+              <w:left w:val="none" w:color="auto" w:sz="0"/>
+              <w:bottom w:val="single" w:color="EEF2F7" w:sz="4"/>
+              <w:right w:val="none" w:color="auto" w:sz="0"/>
+            </w:tcBorders>
+            <w:shd w:fill="FAFBFD" w:val="clear"/>
+            <w:tcMar>
+              <w:top w:type="dxa" w:w="105"/>
+              <w:left w:type="dxa" w:w="158"/>
+              <w:bottom w:type="dxa" w:w="105"/>
+              <w:right w:type="dxa" w:w="158"/>
+            </w:tcMar>
+            <w:vAlign w:val="top"/>
+          </w:tcPr>
+          <w:p>
+            <w:pPr>
+              <w:pStyle w:val="CudocTableCell"/>
+              <w:overflowPunct/>
+              <w:autoSpaceDN/>
+            </w:pPr>
+            <w:r>
+              <w:t xml:space="preserve">Rotate</w:t>
+            </w:r>
+          </w:p>
+        </w:tc>
+        <w:tc>
+          <w:tcPr>
+            <w:tcW w:type="dxa" w:w="6424"/>
+            <w:gridSpan w:val="2"/>
+            <w:tcBorders>
+              <w:top w:val="none" w:color="auto" w:sz="0"/>
+              <w:left w:val="none" w:color="auto" w:sz="0"/>
+              <w:bottom w:val="single" w:color="EEF2F7" w:sz="4"/>
               <w:right w:val="none" w:color="auto" w:sz="0"/>
             </w:tcBorders>
             <w:shd w:fill="FAFBFD" w:val="clear"/>
@@ -416,12 +750,94 @@
           </w:p>
         </w:tc>
       </w:tr>
+      <w:tr>
+        <w:trPr>
+          <w:cantSplit/>
+          <w:tblHeader w:val="false"/>
+        </w:trPr>
+        <w:tc>
+          <w:tcPr>
+            <w:tcW w:type="dxa" w:w="3212"/>
+            <w:gridSpan w:val="1"/>
+            <w:tcBorders>
+              <w:top w:val="none" w:color="auto" w:sz="0"/>
+              <w:left w:val="none" w:color="auto" w:sz="0"/>
+              <w:bottom w:val="none" w:color="auto" w:sz="0"/>
+              <w:right w:val="none" w:color="auto" w:sz="0"/>
+            </w:tcBorders>
+            <w:tcMar>
+              <w:top w:type="dxa" w:w="105"/>
+              <w:left w:type="dxa" w:w="158"/>
+              <w:bottom w:type="dxa" w:w="105"/>
+              <w:right w:type="dxa" w:w="158"/>
+            </w:tcMar>
+            <w:vAlign w:val="top"/>
+          </w:tcPr>
+          <w:p>
+            <w:pPr>
+              <w:pStyle w:val="CudocTableCell"/>
+              <w:overflowPunct/>
+              <w:autoSpaceDN/>
+            </w:pPr>
+            <w:r>
+              <w:t xml:space="preserve">Revoke</w:t>
+            </w:r>
+          </w:p>
+        </w:tc>
+        <w:tc>
+          <w:tcPr>
+            <w:tcW w:type="dxa" w:w="6424"/>
+            <w:gridSpan w:val="2"/>
+            <w:tcBorders>
+              <w:top w:val="none" w:color="auto" w:sz="0"/>
+              <w:left w:val="none" w:color="auto" w:sz="0"/>
+              <w:bottom w:val="none" w:color="auto" w:sz="0"/>
+              <w:right w:val="none" w:color="auto" w:sz="0"/>
+            </w:tcBorders>
+            <w:tcMar>
+              <w:top w:type="dxa" w:w="105"/>
+              <w:left w:type="dxa" w:w="158"/>
+              <w:bottom w:type="dxa" w:w="105"/>
+              <w:right w:type="dxa" w:w="158"/>
+            </w:tcMar>
+            <w:vAlign w:val="top"/>
+          </w:tcPr>
+          <w:p>
+            <w:pPr>
+              <w:pStyle w:val="CudocTableCell"/>
+              <w:numPr>
+                <w:ilvl w:val="0"/>
+                <w:numId w:val="5"/>
+              </w:numPr>
+              <w:overflowPunct/>
+              <w:autoSpaceDN/>
+            </w:pPr>
+            <w:r>
+              <w:t xml:space="preserve">Owner role</w:t>
+            </w:r>
+          </w:p>
+        </w:tc>
+      </w:tr>
     </w:tbl>
     <w:p>
       <w:pPr>
-        <w:pStyle w:val="CudocSpacer"/>
-        <w:spacing w:after="0" w:before="210" w:line="240"/>
-      </w:pPr>
+        <w:pStyle w:val="CudocBody"/>
+        <w:overflowPunct/>
+        <w:spacing w:before="210"/>
+        <w:autoSpaceDN/>
+      </w:pPr>
+      <w:r>
+        <w:t xml:space="preserve">Store the key in your secret manager and expose it to your service as an environment variable; the examples below read </w:t>
+      </w:r>
+      <w:r>
+        <w:rPr>
+          <w:rStyle w:val="CudocCode"/>
+        </w:rPr>
+        <w:t xml:space="preserve">NORTHLIGHT_KEY</w:t>
+      </w:r>
+      <w:r>
+        <w:t xml:space="preserve">.</w:t>
+      </w:r>
     </w:p>
     <w:p>
       <w:pPr>
@@ -440,13 +856,21 @@
         <w:autoSpaceDN/>
       </w:pPr>
       <w:r>
-        <w:t xml:space="preserve">A key grants every scope its project holds. Call Northlight from your own backend and pass results on; never ship the key in client-side code.</w:t>
+        <w:t xml:space="preserve">A key grants every scope its project holds. Call Northlight from your own backend and pass results on; never ship the key in client-side code, a mobile app or a public repository. If a key leaks, revoke it in the console and issue a new one; requests with a revoked key fail with </w:t>
+      </w:r>
+      <w:r>
+        <w:rPr>
+          <w:rStyle w:val="CudocCode"/>
+        </w:rPr>
+        <w:t xml:space="preserve">key_revoked</w:t>
+      </w:r>
+      <w:r>
+        <w:t xml:space="preserve">.</w:t>
       </w:r>
     </w:p>
     <w:p>
       <w:pPr>
         <w:pStyle w:val="Heading2"/>
-        <w:pageBreakBefore/>
         <w:overflowPunct/>
         <w:autoSpaceDN/>
       </w:pPr>
@@ -622,7 +1046,7 @@
         <w:rPr>
           <w:rStyle w:val="CudocCodeString"/>
         </w:rPr>
-        <w:t xml:space="preserve">"temperatureC"</w:t>
+        <w:t xml:space="preserve">"temperature"</w:t>
       </w:r>
       <w:r>
         <w:t xml:space="preserve">:</w:t>
@@ -654,7 +1078,7 @@
         <w:rPr>
           <w:rStyle w:val="CudocCodeString"/>
         </w:rPr>
-        <w:t xml:space="preserve">"windMs"</w:t>
+        <w:t xml:space="preserve">"windSpeed"</w:t>
       </w:r>
       <w:r>
         <w:t xml:space="preserve">:</w:t>
@@ -686,6 +1110,134 @@
         <w:rPr>
           <w:rStyle w:val="CudocCodeString"/>
         </w:rPr>
+        <w:t xml:space="preserve">"windDirection"</w:t>
+      </w:r>
+      <w:r>
+        <w:t xml:space="preserve">:</w:t>
+      </w:r>
+      <w:r>
+        <w:t xml:space="preserve"> </w:t>
+      </w:r>
+      <w:r>
+        <w:rPr>
+          <w:rStyle w:val="CudocCodeNumber"/>
+        </w:rPr>
+        <w:t xml:space="preserve">240</w:t>
+      </w:r>
+      <w:r>
+        <w:t xml:space="preserve">,</w:t>
+      </w:r>
+    </w:p>
+    <w:p>
+      <w:pPr>
+        <w:pStyle w:val="CudocCodeBlock"/>
+        <w:overflowPunct/>
+        <w:spacing w:after="0" w:before="0"/>
+        <w:autoSpaceDN/>
+      </w:pPr>
+      <w:r>
+        <w:t xml:space="preserve">  </w:t>
+      </w:r>
+      <w:r>
+        <w:rPr>
+          <w:rStyle w:val="CudocCodeString"/>
+        </w:rPr>
+        <w:t xml:space="preserve">"humidity"</w:t>
+      </w:r>
+      <w:r>
+        <w:t xml:space="preserve">:</w:t>
+      </w:r>
+      <w:r>
+        <w:t xml:space="preserve"> </w:t>
+      </w:r>
+      <w:r>
+        <w:rPr>
+          <w:rStyle w:val="CudocCodeNumber"/>
+        </w:rPr>
+        <w:t xml:space="preserve">87</w:t>
+      </w:r>
+      <w:r>
+        <w:t xml:space="preserve">,</w:t>
+      </w:r>
+    </w:p>
+    <w:p>
+      <w:pPr>
+        <w:pStyle w:val="CudocCodeBlock"/>
+        <w:overflowPunct/>
+        <w:spacing w:after="0" w:before="0"/>
+        <w:autoSpaceDN/>
+      </w:pPr>
+      <w:r>
+        <w:t xml:space="preserve">  </w:t>
+      </w:r>
+      <w:r>
+        <w:rPr>
+          <w:rStyle w:val="CudocCodeString"/>
+        </w:rPr>
+        <w:t xml:space="preserve">"pressure"</w:t>
+      </w:r>
+      <w:r>
+        <w:t xml:space="preserve">:</w:t>
+      </w:r>
+      <w:r>
+        <w:t xml:space="preserve"> </w:t>
+      </w:r>
+      <w:r>
+        <w:rPr>
+          <w:rStyle w:val="CudocCodeNumber"/>
+        </w:rPr>
+        <w:t xml:space="preserve">1009.6</w:t>
+      </w:r>
+      <w:r>
+        <w:t xml:space="preserve">,</w:t>
+      </w:r>
+    </w:p>
+    <w:p>
+      <w:pPr>
+        <w:pStyle w:val="CudocCodeBlock"/>
+        <w:overflowPunct/>
+        <w:spacing w:after="0" w:before="0"/>
+        <w:autoSpaceDN/>
+      </w:pPr>
+      <w:r>
+        <w:t xml:space="preserve">  </w:t>
+      </w:r>
+      <w:r>
+        <w:rPr>
+          <w:rStyle w:val="CudocCodeString"/>
+        </w:rPr>
+        <w:t xml:space="preserve">"precipitation"</w:t>
+      </w:r>
+      <w:r>
+        <w:t xml:space="preserve">:</w:t>
+      </w:r>
+      <w:r>
+        <w:t xml:space="preserve"> </w:t>
+      </w:r>
+      <w:r>
+        <w:rPr>
+          <w:rStyle w:val="CudocCodeNumber"/>
+        </w:rPr>
+        <w:t xml:space="preserve">0.0</w:t>
+      </w:r>
+      <w:r>
+        <w:t xml:space="preserve">,</w:t>
+      </w:r>
+    </w:p>
+    <w:p>
+      <w:pPr>
+        <w:pStyle w:val="CudocCodeBlock"/>
+        <w:overflowPunct/>
+        <w:spacing w:after="0" w:before="0"/>
+        <w:autoSpaceDN/>
+      </w:pPr>
+      <w:r>
+        <w:t xml:space="preserve">  </w:t>
+      </w:r>
+      <w:r>
+        <w:rPr>
+          <w:rStyle w:val="CudocCodeString"/>
+        </w:rPr>
         <w:t xml:space="preserve">"conditions"</w:t>
       </w:r>
       <w:r>
@@ -700,11 +1252,211 @@
         </w:rPr>
         <w:t xml:space="preserve">"overcast"</w:t>
       </w:r>
+      <w:r>
+        <w:t xml:space="preserve">,</w:t>
+      </w:r>
     </w:p>
     <w:p>
       <w:pPr>
         <w:pStyle w:val="CudocCodeBlock"/>
         <w:overflowPunct/>
+        <w:spacing w:after="0" w:before="0"/>
+        <w:autoSpaceDN/>
+      </w:pPr>
+      <w:r>
+        <w:t xml:space="preserve">  </w:t>
+      </w:r>
+      <w:r>
+        <w:rPr>
+          <w:rStyle w:val="CudocCodeString"/>
+        </w:rPr>
+        <w:t xml:space="preserve">"stale"</w:t>
+      </w:r>
+      <w:r>
+        <w:t xml:space="preserve">:</w:t>
+      </w:r>
+      <w:r>
+        <w:t xml:space="preserve"> </w:t>
+      </w:r>
+      <w:r>
+        <w:rPr>
+          <w:rStyle w:val="CudocCodeKeyword"/>
+        </w:rPr>
+        <w:t xml:space="preserve">false</w:t>
+      </w:r>
+      <w:r>
+        <w:t xml:space="preserve">,</w:t>
+      </w:r>
+    </w:p>
+    <w:p>
+      <w:pPr>
+        <w:pStyle w:val="CudocCodeBlock"/>
+        <w:overflowPunct/>
+        <w:spacing w:after="0" w:before="0"/>
+        <w:autoSpaceDN/>
+      </w:pPr>
+      <w:r>
+        <w:t xml:space="preserve">  </w:t>
+      </w:r>
+      <w:r>
+        <w:rPr>
+          <w:rStyle w:val="CudocCodeString"/>
+        </w:rPr>
+        <w:t xml:space="preserve">"units"</w:t>
+      </w:r>
+      <w:r>
+        <w:t xml:space="preserve">:</w:t>
+      </w:r>
+      <w:r>
+        <w:t xml:space="preserve"> </w:t>
+      </w:r>
+      <w:r>
+        <w:t xml:space="preserve">{</w:t>
+      </w:r>
+    </w:p>
+    <w:p>
+      <w:pPr>
+        <w:pStyle w:val="CudocCodeBlock"/>
+        <w:overflowPunct/>
+        <w:spacing w:after="0" w:before="0"/>
+        <w:autoSpaceDN/>
+      </w:pPr>
+      <w:r>
+        <w:t xml:space="preserve">    </w:t>
+      </w:r>
+      <w:r>
+        <w:rPr>
+          <w:rStyle w:val="CudocCodeString"/>
+        </w:rPr>
+        <w:t xml:space="preserve">"temperature"</w:t>
+      </w:r>
+      <w:r>
+        <w:t xml:space="preserve">:</w:t>
+      </w:r>
+      <w:r>
+        <w:t xml:space="preserve"> </w:t>
+      </w:r>
+      <w:r>
+        <w:rPr>
+          <w:rStyle w:val="CudocCodeString"/>
+        </w:rPr>
+        <w:t xml:space="preserve">"C"</w:t>
+      </w:r>
+      <w:r>
+        <w:t xml:space="preserve">,</w:t>
+      </w:r>
+    </w:p>
+    <w:p>
+      <w:pPr>
+        <w:pStyle w:val="CudocCodeBlock"/>
+        <w:overflowPunct/>
+        <w:spacing w:after="0" w:before="0"/>
+        <w:autoSpaceDN/>
+      </w:pPr>
+      <w:r>
+        <w:t xml:space="preserve">    </w:t>
+      </w:r>
+      <w:r>
+        <w:rPr>
+          <w:rStyle w:val="CudocCodeString"/>
+        </w:rPr>
+        <w:t xml:space="preserve">"windSpeed"</w:t>
+      </w:r>
+      <w:r>
+        <w:t xml:space="preserve">:</w:t>
+      </w:r>
+      <w:r>
+        <w:t xml:space="preserve"> </w:t>
+      </w:r>
+      <w:r>
+        <w:rPr>
+          <w:rStyle w:val="CudocCodeString"/>
+        </w:rPr>
+        <w:t xml:space="preserve">"m/s"</w:t>
+      </w:r>
+      <w:r>
+        <w:t xml:space="preserve">,</w:t>
+      </w:r>
+    </w:p>
+    <w:p>
+      <w:pPr>
+        <w:pStyle w:val="CudocCodeBlock"/>
+        <w:overflowPunct/>
+        <w:spacing w:after="0" w:before="0"/>
+        <w:autoSpaceDN/>
+      </w:pPr>
+      <w:r>
+        <w:t xml:space="preserve">    </w:t>
+      </w:r>
+      <w:r>
+        <w:rPr>
+          <w:rStyle w:val="CudocCodeString"/>
+        </w:rPr>
+        <w:t xml:space="preserve">"pressure"</w:t>
+      </w:r>
+      <w:r>
+        <w:t xml:space="preserve">:</w:t>
+      </w:r>
+      <w:r>
+        <w:t xml:space="preserve"> </w:t>
+      </w:r>
+      <w:r>
+        <w:rPr>
+          <w:rStyle w:val="CudocCodeString"/>
+        </w:rPr>
+        <w:t xml:space="preserve">"hPa"</w:t>
+      </w:r>
+      <w:r>
+        <w:t xml:space="preserve">,</w:t>
+      </w:r>
+    </w:p>
+    <w:p>
+      <w:pPr>
+        <w:pStyle w:val="CudocCodeBlock"/>
+        <w:overflowPunct/>
+        <w:spacing w:after="0" w:before="0"/>
+        <w:autoSpaceDN/>
+      </w:pPr>
+      <w:r>
+        <w:t xml:space="preserve">    </w:t>
+      </w:r>
+      <w:r>
+        <w:rPr>
+          <w:rStyle w:val="CudocCodeString"/>
+        </w:rPr>
+        <w:t xml:space="preserve">"precipitation"</w:t>
+      </w:r>
+      <w:r>
+        <w:t xml:space="preserve">:</w:t>
+      </w:r>
+      <w:r>
+        <w:t xml:space="preserve"> </w:t>
+      </w:r>
+      <w:r>
+        <w:rPr>
+          <w:rStyle w:val="CudocCodeString"/>
+        </w:rPr>
+        <w:t xml:space="preserve">"mm"</w:t>
+      </w:r>
+    </w:p>
+    <w:p>
+      <w:pPr>
+        <w:pStyle w:val="CudocCodeBlock"/>
+        <w:overflowPunct/>
+        <w:spacing w:after="0" w:before="0"/>
+        <w:autoSpaceDN/>
+      </w:pPr>
+      <w:r>
+        <w:t xml:space="preserve">  </w:t>
+      </w:r>
+      <w:r>
+        <w:t xml:space="preserve">}</w:t>
+      </w:r>
+    </w:p>
+    <w:p>
+      <w:pPr>
+        <w:pStyle w:val="CudocCodeBlock"/>
+        <w:overflowPunct/>
         <w:spacing w:after="210" w:before="0"/>
         <w:autoSpaceDN/>
       </w:pPr>
@@ -719,6 +1471,720 @@
         <w:autoSpaceDN/>
       </w:pPr>
       <w:r>
+        <w:t xml:space="preserve">The same request from a Node.js service, with the error envelope handled:</w:t>
+      </w:r>
+    </w:p>
+    <w:p>
+      <w:pPr>
+        <w:pStyle w:val="CudocCodeBlock"/>
+        <w:overflowPunct/>
+        <w:spacing w:after="0" w:before="210"/>
+        <w:autoSpaceDN/>
+      </w:pPr>
+      <w:r>
+        <w:rPr>
+          <w:rStyle w:val="CudocCodeKeyword"/>
+        </w:rPr>
+        <w:t xml:space="preserve">const</w:t>
+      </w:r>
+      <w:r>
+        <w:t xml:space="preserve"> response = </w:t>
+      </w:r>
+      <w:r>
+        <w:rPr>
+          <w:rStyle w:val="CudocCodeKeyword"/>
+        </w:rPr>
+        <w:t xml:space="preserve">await</w:t>
+      </w:r>
+      <w:r>
+        <w:t xml:space="preserve"> </w:t>
+      </w:r>
+      <w:r>
+        <w:rPr>
+          <w:rStyle w:val="CudocCodeNumber"/>
+        </w:rPr>
+        <w:t xml:space="preserve">fetch</w:t>
+      </w:r>
+      <w:r>
+        <w:t xml:space="preserve">(</w:t>
+      </w:r>
+    </w:p>
+    <w:p>
+      <w:pPr>
+        <w:pStyle w:val="CudocCodeBlock"/>
+        <w:overflowPunct/>
+        <w:spacing w:after="0" w:before="0"/>
+        <w:autoSpaceDN/>
+      </w:pPr>
+      <w:r>
+        <w:t xml:space="preserve">  </w:t>
+      </w:r>
+      <w:r>
+        <w:rPr>
+          <w:rStyle w:val="CudocCodeString"/>
+        </w:rPr>
+        <w:t xml:space="preserve">"https://api.northlight.example/v1/weather/current?station=OSL-01"</w:t>
+      </w:r>
+      <w:r>
+        <w:t xml:space="preserve">,</w:t>
+      </w:r>
+    </w:p>
+    <w:p>
+      <w:pPr>
+        <w:pStyle w:val="CudocCodeBlock"/>
+        <w:overflowPunct/>
+        <w:spacing w:after="0" w:before="0"/>
+        <w:autoSpaceDN/>
+      </w:pPr>
+      <w:r>
+        <w:t xml:space="preserve">  { </w:t>
+      </w:r>
+      <w:r>
+        <w:rPr>
+          <w:rStyle w:val="CudocCodeString"/>
+        </w:rPr>
+        <w:t xml:space="preserve">headers</w:t>
+      </w:r>
+      <w:r>
+        <w:t xml:space="preserve">: { </w:t>
+      </w:r>
+      <w:r>
+        <w:rPr>
+          <w:rStyle w:val="CudocCodeNumber"/>
+        </w:rPr>
+        <w:t xml:space="preserve">Authorization</w:t>
+      </w:r>
+      <w:r>
+        <w:t xml:space="preserve">: </w:t>
+      </w:r>
+      <w:r>
+        <w:rPr>
+          <w:rStyle w:val="CudocCodeString"/>
+        </w:rPr>
+        <w:t xml:space="preserve">`Bearer </w:t>
+      </w:r>
+      <w:r>
+        <w:rPr>
+          <w:rStyle w:val="CudocCodeString"/>
+        </w:rPr>
+        <w:t xml:space="preserve">${process.env.NORTHLIGHT_KEY}</w:t>
+      </w:r>
+      <w:r>
+        <w:rPr>
+          <w:rStyle w:val="CudocCodeString"/>
+        </w:rPr>
+        <w:t xml:space="preserve">`</w:t>
+      </w:r>
+      <w:r>
+        <w:t xml:space="preserve"> } },</w:t>
+      </w:r>
+    </w:p>
+    <w:p>
+      <w:pPr>
+        <w:pStyle w:val="CudocCodeBlock"/>
+        <w:overflowPunct/>
+        <w:spacing w:after="0" w:before="0"/>
+        <w:autoSpaceDN/>
+      </w:pPr>
+      <w:r>
+        <w:t xml:space="preserve">)</w:t>
+      </w:r>
+    </w:p>
+    <w:p>
+      <w:pPr>
+        <w:pStyle w:val="CudocCodeBlock"/>
+        <w:overflowPunct/>
+        <w:spacing w:after="0" w:before="0"/>
+        <w:autoSpaceDN/>
+      </w:pPr>
+      <w:r>
+        <w:rPr>
+          <w:rStyle w:val="CudocCodeKeyword"/>
+        </w:rPr>
+        <w:t xml:space="preserve">const</w:t>
+      </w:r>
+      <w:r>
+        <w:t xml:space="preserve"> body = </w:t>
+      </w:r>
+      <w:r>
+        <w:rPr>
+          <w:rStyle w:val="CudocCodeKeyword"/>
+        </w:rPr>
+        <w:t xml:space="preserve">await</w:t>
+      </w:r>
+      <w:r>
+        <w:t xml:space="preserve"> response.</w:t>
+      </w:r>
+      <w:r>
+        <w:rPr>
+          <w:rStyle w:val="CudocCodeNumber"/>
+        </w:rPr>
+        <w:t xml:space="preserve">json</w:t>
+      </w:r>
+      <w:r>
+        <w:t xml:space="preserve">()</w:t>
+      </w:r>
+    </w:p>
+    <w:p>
+      <w:pPr>
+        <w:pStyle w:val="CudocCodeBlock"/>
+        <w:overflowPunct/>
+        <w:spacing w:after="0" w:before="0"/>
+        <w:autoSpaceDN/>
+      </w:pPr>
+      <w:r>
+        <w:rPr>
+          <w:rStyle w:val="CudocCodeKeyword"/>
+        </w:rPr>
+        <w:t xml:space="preserve">if</w:t>
+      </w:r>
+      <w:r>
+        <w:t xml:space="preserve"> (!response.</w:t>
+      </w:r>
+      <w:r>
+        <w:t xml:space="preserve">ok</w:t>
+      </w:r>
+      <w:r>
+        <w:t xml:space="preserve">) </w:t>
+      </w:r>
+      <w:r>
+        <w:rPr>
+          <w:rStyle w:val="CudocCodeKeyword"/>
+        </w:rPr>
+        <w:t xml:space="preserve">throw</w:t>
+      </w:r>
+      <w:r>
+        <w:t xml:space="preserve"> </w:t>
+      </w:r>
+      <w:r>
+        <w:rPr>
+          <w:rStyle w:val="CudocCodeKeyword"/>
+        </w:rPr>
+        <w:t xml:space="preserve">new</w:t>
+      </w:r>
+      <w:r>
+        <w:t xml:space="preserve"> </w:t>
+      </w:r>
+      <w:r>
+        <w:rPr>
+          <w:rStyle w:val="CudocCodeNumber"/>
+        </w:rPr>
+        <w:t xml:space="preserve">Error</w:t>
+      </w:r>
+      <w:r>
+        <w:t xml:space="preserve">(</w:t>
+      </w:r>
+      <w:r>
+        <w:rPr>
+          <w:rStyle w:val="CudocCodeString"/>
+        </w:rPr>
+        <w:t xml:space="preserve">`</w:t>
+      </w:r>
+      <w:r>
+        <w:rPr>
+          <w:rStyle w:val="CudocCodeString"/>
+        </w:rPr>
+        <w:t xml:space="preserve">${body.error.code}</w:t>
+      </w:r>
+      <w:r>
+        <w:rPr>
+          <w:rStyle w:val="CudocCodeString"/>
+        </w:rPr>
+        <w:t xml:space="preserve">: </w:t>
+      </w:r>
+      <w:r>
+        <w:rPr>
+          <w:rStyle w:val="CudocCodeString"/>
+        </w:rPr>
+        <w:t xml:space="preserve">${body.error.message}</w:t>
+      </w:r>
+      <w:r>
+        <w:rPr>
+          <w:rStyle w:val="CudocCodeString"/>
+        </w:rPr>
+        <w:t xml:space="preserve">`</w:t>
+      </w:r>
+      <w:r>
+        <w:t xml:space="preserve">)</w:t>
+      </w:r>
+    </w:p>
+    <w:p>
+      <w:pPr>
+        <w:pStyle w:val="CudocCodeBlock"/>
+        <w:overflowPunct/>
+        <w:spacing w:after="210" w:before="0"/>
+        <w:autoSpaceDN/>
+      </w:pPr>
+      <w:r>
+        <w:t xml:space="preserve">console</w:t>
+      </w:r>
+      <w:r>
+        <w:t xml:space="preserve">.</w:t>
+      </w:r>
+      <w:r>
+        <w:rPr>
+          <w:rStyle w:val="CudocCodeNumber"/>
+        </w:rPr>
+        <w:t xml:space="preserve">log</w:t>
+      </w:r>
+      <w:r>
+        <w:t xml:space="preserve">(</w:t>
+      </w:r>
+      <w:r>
+        <w:rPr>
+          <w:rStyle w:val="CudocCodeString"/>
+        </w:rPr>
+        <w:t xml:space="preserve">`</w:t>
+      </w:r>
+      <w:r>
+        <w:rPr>
+          <w:rStyle w:val="CudocCodeString"/>
+        </w:rPr>
+        <w:t xml:space="preserve">${body.station}</w:t>
+      </w:r>
+      <w:r>
+        <w:rPr>
+          <w:rStyle w:val="CudocCodeString"/>
+        </w:rPr>
+        <w:t xml:space="preserve">: </w:t>
+      </w:r>
+      <w:r>
+        <w:rPr>
+          <w:rStyle w:val="CudocCodeString"/>
+        </w:rPr>
+        <w:t xml:space="preserve">${body.temperature}</w:t>
+      </w:r>
+      <w:r>
+        <w:rPr>
+          <w:rStyle w:val="CudocCodeString"/>
+        </w:rPr>
+        <w:t xml:space="preserve"> °</w:t>
+      </w:r>
+      <w:r>
+        <w:rPr>
+          <w:rStyle w:val="CudocCodeString"/>
+        </w:rPr>
+        <w:t xml:space="preserve">${body.units.temperature}</w:t>
+      </w:r>
+      <w:r>
+        <w:rPr>
+          <w:rStyle w:val="CudocCodeString"/>
+        </w:rPr>
+        <w:t xml:space="preserve">`</w:t>
+      </w:r>
+      <w:r>
+        <w:t xml:space="preserve">)</w:t>
+      </w:r>
+    </w:p>
+    <w:p>
+      <w:pPr>
+        <w:pStyle w:val="CudocBody"/>
+        <w:overflowPunct/>
+        <w:autoSpaceDN/>
+      </w:pPr>
+      <w:r>
+        <w:t xml:space="preserve">And from Python:</w:t>
+      </w:r>
+    </w:p>
+    <w:p>
+      <w:pPr>
+        <w:pStyle w:val="CudocCodeBlock"/>
+        <w:overflowPunct/>
+        <w:spacing w:after="0" w:before="210"/>
+        <w:autoSpaceDN/>
+      </w:pPr>
+      <w:r>
+        <w:rPr>
+          <w:rStyle w:val="CudocCodeKeyword"/>
+        </w:rPr>
+        <w:t xml:space="preserve">import</w:t>
+      </w:r>
+      <w:r>
+        <w:t xml:space="preserve"> os</w:t>
+      </w:r>
+    </w:p>
+    <w:p>
+      <w:pPr>
+        <w:pStyle w:val="CudocCodeBlock"/>
+        <w:overflowPunct/>
+        <w:spacing w:after="0" w:before="0"/>
+        <w:autoSpaceDN/>
+      </w:pPr>
+      <w:r>
+        <w:rPr>
+          <w:rStyle w:val="CudocCodeKeyword"/>
+        </w:rPr>
+        <w:t xml:space="preserve">import</w:t>
+      </w:r>
+      <w:r>
+        <w:t xml:space="preserve"> requests</w:t>
+      </w:r>
+    </w:p>
+    <w:p>
+      <w:pPr>
+        <w:pStyle w:val="CudocCodeBlock"/>
+        <w:overflowPunct/>
+        <w:spacing w:after="0" w:before="0"/>
+        <w:autoSpaceDN/>
+      </w:pPr>
+      <w:r>
+        <w:t xml:space="preserve"/>
+      </w:r>
+    </w:p>
+    <w:p>
+      <w:pPr>
+        <w:pStyle w:val="CudocCodeBlock"/>
+        <w:overflowPunct/>
+        <w:spacing w:after="0" w:before="0"/>
+        <w:autoSpaceDN/>
+      </w:pPr>
+      <w:r>
+        <w:t xml:space="preserve">response = requests.get(</w:t>
+      </w:r>
+    </w:p>
+    <w:p>
+      <w:pPr>
+        <w:pStyle w:val="CudocCodeBlock"/>
+        <w:overflowPunct/>
+        <w:spacing w:after="0" w:before="0"/>
+        <w:autoSpaceDN/>
+      </w:pPr>
+      <w:r>
+        <w:t xml:space="preserve">    </w:t>
+      </w:r>
+      <w:r>
+        <w:rPr>
+          <w:rStyle w:val="CudocCodeString"/>
+        </w:rPr>
+        <w:t xml:space="preserve">"https://api.northlight.example/v1/weather/current"</w:t>
+      </w:r>
+      <w:r>
+        <w:t xml:space="preserve">,</w:t>
+      </w:r>
+    </w:p>
+    <w:p>
+      <w:pPr>
+        <w:pStyle w:val="CudocCodeBlock"/>
+        <w:overflowPunct/>
+        <w:spacing w:after="0" w:before="0"/>
+        <w:autoSpaceDN/>
+      </w:pPr>
+      <w:r>
+        <w:t xml:space="preserve">    params={</w:t>
+      </w:r>
+      <w:r>
+        <w:rPr>
+          <w:rStyle w:val="CudocCodeString"/>
+        </w:rPr>
+        <w:t xml:space="preserve">"station"</w:t>
+      </w:r>
+      <w:r>
+        <w:t xml:space="preserve">: </w:t>
+      </w:r>
+      <w:r>
+        <w:rPr>
+          <w:rStyle w:val="CudocCodeString"/>
+        </w:rPr>
+        <w:t xml:space="preserve">"OSL-01"</w:t>
+      </w:r>
+      <w:r>
+        <w:t xml:space="preserve">},</w:t>
+      </w:r>
+    </w:p>
+    <w:p>
+      <w:pPr>
+        <w:pStyle w:val="CudocCodeBlock"/>
+        <w:overflowPunct/>
+        <w:spacing w:after="0" w:before="0"/>
+        <w:autoSpaceDN/>
+      </w:pPr>
+      <w:r>
+        <w:t xml:space="preserve">    headers={</w:t>
+      </w:r>
+      <w:r>
+        <w:rPr>
+          <w:rStyle w:val="CudocCodeString"/>
+        </w:rPr>
+        <w:t xml:space="preserve">"Authorization"</w:t>
+      </w:r>
+      <w:r>
+        <w:t xml:space="preserve">: </w:t>
+      </w:r>
+      <w:r>
+        <w:rPr>
+          <w:rStyle w:val="CudocCodeString"/>
+        </w:rPr>
+        <w:t xml:space="preserve">f"Bearer </w:t>
+      </w:r>
+      <w:r>
+        <w:rPr>
+          <w:rStyle w:val="CudocCodeString"/>
+        </w:rPr>
+        <w:t xml:space="preserve">{os.environ[</w:t>
+      </w:r>
+      <w:r>
+        <w:rPr>
+          <w:rStyle w:val="CudocCodeString"/>
+        </w:rPr>
+        <w:t xml:space="preserve">'NORTHLIGHT_KEY'</w:t>
+      </w:r>
+      <w:r>
+        <w:rPr>
+          <w:rStyle w:val="CudocCodeString"/>
+        </w:rPr>
+        <w:t xml:space="preserve">]}</w:t>
+      </w:r>
+      <w:r>
+        <w:rPr>
+          <w:rStyle w:val="CudocCodeString"/>
+        </w:rPr>
+        <w:t xml:space="preserve">"</w:t>
+      </w:r>
+      <w:r>
+        <w:t xml:space="preserve">},</w:t>
+      </w:r>
+    </w:p>
+    <w:p>
+      <w:pPr>
+        <w:pStyle w:val="CudocCodeBlock"/>
+        <w:overflowPunct/>
+        <w:spacing w:after="0" w:before="0"/>
+        <w:autoSpaceDN/>
+      </w:pPr>
+      <w:r>
+        <w:t xml:space="preserve">    timeout=</w:t>
+      </w:r>
+      <w:r>
+        <w:rPr>
+          <w:rStyle w:val="CudocCodeNumber"/>
+        </w:rPr>
+        <w:t xml:space="preserve">5</w:t>
+      </w:r>
+      <w:r>
+        <w:t xml:space="preserve">,</w:t>
+      </w:r>
+    </w:p>
+    <w:p>
+      <w:pPr>
+        <w:pStyle w:val="CudocCodeBlock"/>
+        <w:overflowPunct/>
+        <w:spacing w:after="0" w:before="0"/>
+        <w:autoSpaceDN/>
+      </w:pPr>
+      <w:r>
+        <w:t xml:space="preserve">)</w:t>
+      </w:r>
+    </w:p>
+    <w:p>
+      <w:pPr>
+        <w:pStyle w:val="CudocCodeBlock"/>
+        <w:overflowPunct/>
+        <w:spacing w:after="0" w:before="0"/>
+        <w:autoSpaceDN/>
+      </w:pPr>
+      <w:r>
+        <w:t xml:space="preserve">body = response.json()</w:t>
+      </w:r>
+    </w:p>
+    <w:p>
+      <w:pPr>
+        <w:pStyle w:val="CudocCodeBlock"/>
+        <w:overflowPunct/>
+        <w:spacing w:after="0" w:before="0"/>
+        <w:autoSpaceDN/>
+      </w:pPr>
+      <w:r>
+        <w:rPr>
+          <w:rStyle w:val="CudocCodeKeyword"/>
+        </w:rPr>
+        <w:t xml:space="preserve">if</w:t>
+      </w:r>
+      <w:r>
+        <w:t xml:space="preserve"> </w:t>
+      </w:r>
+      <w:r>
+        <w:rPr>
+          <w:rStyle w:val="CudocCodeKeyword"/>
+        </w:rPr>
+        <w:t xml:space="preserve">not</w:t>
+      </w:r>
+      <w:r>
+        <w:t xml:space="preserve"> response.ok:</w:t>
+      </w:r>
+    </w:p>
+    <w:p>
+      <w:pPr>
+        <w:pStyle w:val="CudocCodeBlock"/>
+        <w:overflowPunct/>
+        <w:spacing w:after="0" w:before="0"/>
+        <w:autoSpaceDN/>
+      </w:pPr>
+      <w:r>
+        <w:t xml:space="preserve">    </w:t>
+      </w:r>
+      <w:r>
+        <w:rPr>
+          <w:rStyle w:val="CudocCodeKeyword"/>
+        </w:rPr>
+        <w:t xml:space="preserve">raise</w:t>
+      </w:r>
+      <w:r>
+        <w:t xml:space="preserve"> RuntimeError(</w:t>
+      </w:r>
+      <w:r>
+        <w:rPr>
+          <w:rStyle w:val="CudocCodeString"/>
+        </w:rPr>
+        <w:t xml:space="preserve">f"</w:t>
+      </w:r>
+      <w:r>
+        <w:rPr>
+          <w:rStyle w:val="CudocCodeString"/>
+        </w:rPr>
+        <w:t xml:space="preserve">{body[</w:t>
+      </w:r>
+      <w:r>
+        <w:rPr>
+          <w:rStyle w:val="CudocCodeString"/>
+        </w:rPr>
+        <w:t xml:space="preserve">'error'</w:t>
+      </w:r>
+      <w:r>
+        <w:rPr>
+          <w:rStyle w:val="CudocCodeString"/>
+        </w:rPr>
+        <w:t xml:space="preserve">][</w:t>
+      </w:r>
+      <w:r>
+        <w:rPr>
+          <w:rStyle w:val="CudocCodeString"/>
+        </w:rPr>
+        <w:t xml:space="preserve">'code'</w:t>
+      </w:r>
+      <w:r>
+        <w:rPr>
+          <w:rStyle w:val="CudocCodeString"/>
+        </w:rPr>
+        <w:t xml:space="preserve">]}</w:t>
+      </w:r>
+      <w:r>
+        <w:rPr>
+          <w:rStyle w:val="CudocCodeString"/>
+        </w:rPr>
+        <w:t xml:space="preserve">: </w:t>
+      </w:r>
+      <w:r>
+        <w:rPr>
+          <w:rStyle w:val="CudocCodeString"/>
+        </w:rPr>
+        <w:t xml:space="preserve">{body[</w:t>
+      </w:r>
+      <w:r>
+        <w:rPr>
+          <w:rStyle w:val="CudocCodeString"/>
+        </w:rPr>
+        <w:t xml:space="preserve">'error'</w:t>
+      </w:r>
+      <w:r>
+        <w:rPr>
+          <w:rStyle w:val="CudocCodeString"/>
+        </w:rPr>
+        <w:t xml:space="preserve">][</w:t>
+      </w:r>
+      <w:r>
+        <w:rPr>
+          <w:rStyle w:val="CudocCodeString"/>
+        </w:rPr>
+        <w:t xml:space="preserve">'message'</w:t>
+      </w:r>
+      <w:r>
+        <w:rPr>
+          <w:rStyle w:val="CudocCodeString"/>
+        </w:rPr>
+        <w:t xml:space="preserve">]}</w:t>
+      </w:r>
+      <w:r>
+        <w:rPr>
+          <w:rStyle w:val="CudocCodeString"/>
+        </w:rPr>
+        <w:t xml:space="preserve">"</w:t>
+      </w:r>
+      <w:r>
+        <w:t xml:space="preserve">)</w:t>
+      </w:r>
+    </w:p>
+    <w:p>
+      <w:pPr>
+        <w:pStyle w:val="CudocCodeBlock"/>
+        <w:overflowPunct/>
+        <w:spacing w:after="210" w:before="0"/>
+        <w:autoSpaceDN/>
+      </w:pPr>
+      <w:r>
+        <w:rPr>
+          <w:rStyle w:val="CudocCodeKeyword"/>
+        </w:rPr>
+        <w:t xml:space="preserve">print</w:t>
+      </w:r>
+      <w:r>
+        <w:t xml:space="preserve">(body[</w:t>
+      </w:r>
+      <w:r>
+        <w:rPr>
+          <w:rStyle w:val="CudocCodeString"/>
+        </w:rPr>
+        <w:t xml:space="preserve">"station"</w:t>
+      </w:r>
+      <w:r>
+        <w:t xml:space="preserve">], body[</w:t>
+      </w:r>
+      <w:r>
+        <w:rPr>
+          <w:rStyle w:val="CudocCodeString"/>
+        </w:rPr>
+        <w:t xml:space="preserve">"temperature"</w:t>
+      </w:r>
+      <w:r>
+        <w:t xml:space="preserve">], body[</w:t>
+      </w:r>
+      <w:r>
+        <w:rPr>
+          <w:rStyle w:val="CudocCodeString"/>
+        </w:rPr>
+        <w:t xml:space="preserve">"units"</w:t>
+      </w:r>
+      <w:r>
+        <w:t xml:space="preserve">][</w:t>
+      </w:r>
+      <w:r>
+        <w:rPr>
+          <w:rStyle w:val="CudocCodeString"/>
+        </w:rPr>
+        <w:t xml:space="preserve">"temperature"</w:t>
+      </w:r>
+      <w:r>
+        <w:t xml:space="preserve">])</w:t>
+      </w:r>
+    </w:p>
+    <w:p>
+      <w:pPr>
+        <w:pStyle w:val="Heading2"/>
+        <w:overflowPunct/>
+        <w:autoSpaceDN/>
+      </w:pPr>
+      <w:bookmarkStart w:name="cudoc2Cnkxp5RB7zbli78IKznuDPKwu" w:id="6"/>
+      <w:r>
+        <w:t xml:space="preserve">Read the response</w:t>
+      </w:r>
+      <w:bookmarkEnd w:id="6"/>
+    </w:p>
+    <w:p>
+      <w:pPr>
+        <w:pStyle w:val="CudocBody"/>
+        <w:overflowPunct/>
+        <w:autoSpaceDN/>
+      </w:pPr>
+      <w:r>
         <w:t xml:space="preserve">Every response carries </w:t>
       </w:r>
       <w:r>
@@ -737,12 +2203,806 @@
         <w:footnoteReference w:id="1"/>
       </w:r>
       <w:r>
-        <w:t xml:space="preserve">. A missing station returns </w:t>
+        <w:t xml:space="preserve">, and a </w:t>
       </w:r>
       <w:r>
         <w:rPr>
           <w:rStyle w:val="CudocCode"/>
         </w:rPr>
+        <w:t xml:space="preserve">units</w:t>
+      </w:r>
+      <w:r>
+        <w:t xml:space="preserve"> object naming the unit of every numeric field. The fields you will use most:</w:t>
+      </w:r>
+    </w:p>
+    <w:tbl>
+      <w:tblPr>
+        <w:tblW w:type="pct" w:w="100%"/>
+        <w:tblBorders>
+          <w:top w:val="single" w:color="E2E8F0" w:sz="4"/>
+          <w:left w:val="none" w:color="auto" w:sz="0"/>
+          <w:bottom w:val="single" w:color="E2E8F0" w:sz="4"/>
+          <w:right w:val="none" w:color="auto" w:sz="0"/>
+          <w:insideH w:val="none" w:color="auto" w:sz="0"/>
+          <w:insideV w:val="none" w:color="auto" w:sz="0"/>
+        </w:tblBorders>
+      </w:tblPr>
+      <w:tblGrid>
+        <w:gridCol w:w="2659"/>
+        <w:gridCol w:w="2659"/>
+        <w:gridCol w:w="4320"/>
+      </w:tblGrid>
+      <w:tr>
+        <w:trPr>
+          <w:cantSplit/>
+          <w:tblHeader/>
+        </w:trPr>
+        <w:tc>
+          <w:tcPr>
+            <w:tcW w:type="dxa" w:w="2659"/>
+            <w:gridSpan w:val="1"/>
+            <w:tcBorders>
+              <w:top w:val="none" w:color="auto" w:sz="0"/>
+              <w:left w:val="none" w:color="auto" w:sz="0"/>
+              <w:bottom w:val="single" w:color="E2E8F0" w:sz="4"/>
+              <w:right w:val="none" w:color="auto" w:sz="0"/>
+            </w:tcBorders>
+            <w:tcMar>
+              <w:top w:type="dxa" w:w="105"/>
+              <w:left w:type="dxa" w:w="158"/>
+              <w:bottom w:type="dxa" w:w="105"/>
+              <w:right w:type="dxa" w:w="158"/>
+            </w:tcMar>
+            <w:vAlign w:val="top"/>
+          </w:tcPr>
+          <w:p>
+            <w:pPr>
+              <w:pStyle w:val="CudocTableHeader"/>
+              <w:overflowPunct/>
+              <w:autoSpaceDN/>
+            </w:pPr>
+            <w:r>
+              <w:t xml:space="preserve">Field</w:t>
+            </w:r>
+          </w:p>
+        </w:tc>
+        <w:tc>
+          <w:tcPr>
+            <w:tcW w:type="dxa" w:w="2659"/>
+            <w:gridSpan w:val="1"/>
+            <w:tcBorders>
+              <w:top w:val="none" w:color="auto" w:sz="0"/>
+              <w:left w:val="none" w:color="auto" w:sz="0"/>
+              <w:bottom w:val="single" w:color="E2E8F0" w:sz="4"/>
+              <w:right w:val="none" w:color="auto" w:sz="0"/>
+            </w:tcBorders>
+            <w:tcMar>
+              <w:top w:type="dxa" w:w="105"/>
+              <w:left w:type="dxa" w:w="158"/>
+              <w:bottom w:type="dxa" w:w="105"/>
+              <w:right w:type="dxa" w:w="158"/>
+            </w:tcMar>
+            <w:vAlign w:val="top"/>
+          </w:tcPr>
+          <w:p>
+            <w:pPr>
+              <w:pStyle w:val="CudocTableHeader"/>
+              <w:overflowPunct/>
+              <w:autoSpaceDN/>
+            </w:pPr>
+            <w:r>
+              <w:t xml:space="preserve">Type</w:t>
+            </w:r>
+          </w:p>
+        </w:tc>
+        <w:tc>
+          <w:tcPr>
+            <w:tcW w:type="dxa" w:w="4320"/>
+            <w:gridSpan w:val="1"/>
+            <w:tcBorders>
+              <w:top w:val="none" w:color="auto" w:sz="0"/>
+              <w:left w:val="none" w:color="auto" w:sz="0"/>
+              <w:bottom w:val="single" w:color="E2E8F0" w:sz="4"/>
+              <w:right w:val="none" w:color="auto" w:sz="0"/>
+            </w:tcBorders>
+            <w:tcMar>
+              <w:top w:type="dxa" w:w="105"/>
+              <w:left w:type="dxa" w:w="158"/>
+              <w:bottom w:type="dxa" w:w="105"/>
+              <w:right w:type="dxa" w:w="158"/>
+            </w:tcMar>
+            <w:vAlign w:val="top"/>
+          </w:tcPr>
+          <w:p>
+            <w:pPr>
+              <w:pStyle w:val="CudocTableHeader"/>
+              <w:overflowPunct/>
+              <w:autoSpaceDN/>
+            </w:pPr>
+            <w:r>
+              <w:t xml:space="preserve">Description</w:t>
+            </w:r>
+          </w:p>
+        </w:tc>
+      </w:tr>
+      <w:tr>
+        <w:trPr>
+          <w:cantSplit/>
+          <w:tblHeader w:val="false"/>
+        </w:trPr>
+        <w:tc>
+          <w:tcPr>
+            <w:tcW w:type="dxa" w:w="2659"/>
+            <w:gridSpan w:val="1"/>
+            <w:tcBorders>
+              <w:top w:val="none" w:color="auto" w:sz="0"/>
+              <w:left w:val="none" w:color="auto" w:sz="0"/>
+              <w:bottom w:val="single" w:color="EEF2F7" w:sz="4"/>
+              <w:right w:val="none" w:color="auto" w:sz="0"/>
+            </w:tcBorders>
+            <w:tcMar>
+              <w:top w:type="dxa" w:w="105"/>
+              <w:left w:type="dxa" w:w="158"/>
+              <w:bottom w:type="dxa" w:w="105"/>
+              <w:right w:type="dxa" w:w="158"/>
+            </w:tcMar>
+            <w:vAlign w:val="top"/>
+          </w:tcPr>
+          <w:p>
+            <w:pPr>
+              <w:pStyle w:val="CudocTableCell"/>
+              <w:overflowPunct/>
+              <w:autoSpaceDN/>
+            </w:pPr>
+            <w:r>
+              <w:rPr>
+                <w:rStyle w:val="CudocCode"/>
+              </w:rPr>
+              <w:t xml:space="preserve">observedAt</w:t>
+            </w:r>
+          </w:p>
+        </w:tc>
+        <w:tc>
+          <w:tcPr>
+            <w:tcW w:type="dxa" w:w="2659"/>
+            <w:gridSpan w:val="1"/>
+            <w:tcBorders>
+              <w:top w:val="none" w:color="auto" w:sz="0"/>
+              <w:left w:val="none" w:color="auto" w:sz="0"/>
+              <w:bottom w:val="single" w:color="EEF2F7" w:sz="4"/>
+              <w:right w:val="none" w:color="auto" w:sz="0"/>
+            </w:tcBorders>
+            <w:tcMar>
+              <w:top w:type="dxa" w:w="105"/>
+              <w:left w:type="dxa" w:w="158"/>
+              <w:bottom w:type="dxa" w:w="105"/>
+              <w:right w:type="dxa" w:w="158"/>
+            </w:tcMar>
+            <w:vAlign w:val="top"/>
+          </w:tcPr>
+          <w:p>
+            <w:pPr>
+              <w:pStyle w:val="CudocTableCell"/>
+              <w:overflowPunct/>
+              <w:autoSpaceDN/>
+            </w:pPr>
+            <w:r>
+              <w:t xml:space="preserve">string</w:t>
+            </w:r>
+          </w:p>
+        </w:tc>
+        <w:tc>
+          <w:tcPr>
+            <w:tcW w:type="dxa" w:w="4320"/>
+            <w:gridSpan w:val="1"/>
+            <w:tcBorders>
+              <w:top w:val="none" w:color="auto" w:sz="0"/>
+              <w:left w:val="none" w:color="auto" w:sz="0"/>
+              <w:bottom w:val="single" w:color="EEF2F7" w:sz="4"/>
+              <w:right w:val="none" w:color="auto" w:sz="0"/>
+            </w:tcBorders>
+            <w:tcMar>
+              <w:top w:type="dxa" w:w="105"/>
+              <w:left w:type="dxa" w:w="158"/>
+              <w:bottom w:type="dxa" w:w="105"/>
+              <w:right w:type="dxa" w:w="158"/>
+            </w:tcMar>
+            <w:vAlign w:val="top"/>
+          </w:tcPr>
+          <w:p>
+            <w:pPr>
+              <w:pStyle w:val="CudocTableCell"/>
+              <w:overflowPunct/>
+              <w:autoSpaceDN/>
+            </w:pPr>
+            <w:r>
+              <w:t xml:space="preserve">When the station made the reading, ISO 8601 in UTC.</w:t>
+            </w:r>
+          </w:p>
+        </w:tc>
+      </w:tr>
+      <w:tr>
+        <w:trPr>
+          <w:cantSplit/>
+          <w:tblHeader w:val="false"/>
+        </w:trPr>
+        <w:tc>
+          <w:tcPr>
+            <w:tcW w:type="dxa" w:w="2659"/>
+            <w:gridSpan w:val="1"/>
+            <w:tcBorders>
+              <w:top w:val="none" w:color="auto" w:sz="0"/>
+              <w:left w:val="none" w:color="auto" w:sz="0"/>
+              <w:bottom w:val="single" w:color="EEF2F7" w:sz="4"/>
+              <w:right w:val="none" w:color="auto" w:sz="0"/>
+            </w:tcBorders>
+            <w:shd w:fill="FAFBFD" w:val="clear"/>
+            <w:tcMar>
+              <w:top w:type="dxa" w:w="105"/>
+              <w:left w:type="dxa" w:w="158"/>
+              <w:bottom w:type="dxa" w:w="105"/>
+              <w:right w:type="dxa" w:w="158"/>
+            </w:tcMar>
+            <w:vAlign w:val="top"/>
+          </w:tcPr>
+          <w:p>
+            <w:pPr>
+              <w:pStyle w:val="CudocTableCell"/>
+              <w:overflowPunct/>
+              <w:autoSpaceDN/>
+            </w:pPr>
+            <w:r>
+              <w:rPr>
+                <w:rStyle w:val="CudocCode"/>
+              </w:rPr>
+              <w:t xml:space="preserve">temperature</w:t>
+            </w:r>
+          </w:p>
+        </w:tc>
+        <w:tc>
+          <w:tcPr>
+            <w:tcW w:type="dxa" w:w="2659"/>
+            <w:gridSpan w:val="1"/>
+            <w:tcBorders>
+              <w:top w:val="none" w:color="auto" w:sz="0"/>
+              <w:left w:val="none" w:color="auto" w:sz="0"/>
+              <w:bottom w:val="single" w:color="EEF2F7" w:sz="4"/>
+              <w:right w:val="none" w:color="auto" w:sz="0"/>
+            </w:tcBorders>
+            <w:shd w:fill="FAFBFD" w:val="clear"/>
+            <w:tcMar>
+              <w:top w:type="dxa" w:w="105"/>
+              <w:left w:type="dxa" w:w="158"/>
+              <w:bottom w:type="dxa" w:w="105"/>
+              <w:right w:type="dxa" w:w="158"/>
+            </w:tcMar>
+            <w:vAlign w:val="top"/>
+          </w:tcPr>
+          <w:p>
+            <w:pPr>
+              <w:pStyle w:val="CudocTableCell"/>
+              <w:overflowPunct/>
+              <w:autoSpaceDN/>
+            </w:pPr>
+            <w:r>
+              <w:t xml:space="preserve">number</w:t>
+            </w:r>
+          </w:p>
+        </w:tc>
+        <w:tc>
+          <w:tcPr>
+            <w:tcW w:type="dxa" w:w="4320"/>
+            <w:gridSpan w:val="1"/>
+            <w:tcBorders>
+              <w:top w:val="none" w:color="auto" w:sz="0"/>
+              <w:left w:val="none" w:color="auto" w:sz="0"/>
+              <w:bottom w:val="single" w:color="EEF2F7" w:sz="4"/>
+              <w:right w:val="none" w:color="auto" w:sz="0"/>
+            </w:tcBorders>
+            <w:shd w:fill="FAFBFD" w:val="clear"/>
+            <w:tcMar>
+              <w:top w:type="dxa" w:w="105"/>
+              <w:left w:type="dxa" w:w="158"/>
+              <w:bottom w:type="dxa" w:w="105"/>
+              <w:right w:type="dxa" w:w="158"/>
+            </w:tcMar>
+            <w:vAlign w:val="top"/>
+          </w:tcPr>
+          <w:p>
+            <w:pPr>
+              <w:pStyle w:val="CudocTableCell"/>
+              <w:overflowPunct/>
+              <w:autoSpaceDN/>
+            </w:pPr>
+            <w:r>
+              <w:t xml:space="preserve">Air temperature two metres above ground.</w:t>
+            </w:r>
+          </w:p>
+        </w:tc>
+      </w:tr>
+      <w:tr>
+        <w:trPr>
+          <w:cantSplit/>
+          <w:tblHeader w:val="false"/>
+        </w:trPr>
+        <w:tc>
+          <w:tcPr>
+            <w:tcW w:type="dxa" w:w="2659"/>
+            <w:gridSpan w:val="1"/>
+            <w:tcBorders>
+              <w:top w:val="none" w:color="auto" w:sz="0"/>
+              <w:left w:val="none" w:color="auto" w:sz="0"/>
+              <w:bottom w:val="single" w:color="EEF2F7" w:sz="4"/>
+              <w:right w:val="none" w:color="auto" w:sz="0"/>
+            </w:tcBorders>
+            <w:tcMar>
+              <w:top w:type="dxa" w:w="105"/>
+              <w:left w:type="dxa" w:w="158"/>
+              <w:bottom w:type="dxa" w:w="105"/>
+              <w:right w:type="dxa" w:w="158"/>
+            </w:tcMar>
+            <w:vAlign w:val="top"/>
+          </w:tcPr>
+          <w:p>
+            <w:pPr>
+              <w:pStyle w:val="CudocTableCell"/>
+              <w:overflowPunct/>
+              <w:autoSpaceDN/>
+            </w:pPr>
+            <w:r>
+              <w:rPr>
+                <w:rStyle w:val="CudocCode"/>
+              </w:rPr>
+              <w:t xml:space="preserve">windSpeed</w:t>
+            </w:r>
+          </w:p>
+        </w:tc>
+        <w:tc>
+          <w:tcPr>
+            <w:tcW w:type="dxa" w:w="2659"/>
+            <w:gridSpan w:val="1"/>
+            <w:tcBorders>
+              <w:top w:val="none" w:color="auto" w:sz="0"/>
+              <w:left w:val="none" w:color="auto" w:sz="0"/>
+              <w:bottom w:val="single" w:color="EEF2F7" w:sz="4"/>
+              <w:right w:val="none" w:color="auto" w:sz="0"/>
+            </w:tcBorders>
+            <w:tcMar>
+              <w:top w:type="dxa" w:w="105"/>
+              <w:left w:type="dxa" w:w="158"/>
+              <w:bottom w:type="dxa" w:w="105"/>
+              <w:right w:type="dxa" w:w="158"/>
+            </w:tcMar>
+            <w:vAlign w:val="top"/>
+          </w:tcPr>
+          <w:p>
+            <w:pPr>
+              <w:pStyle w:val="CudocTableCell"/>
+              <w:overflowPunct/>
+              <w:autoSpaceDN/>
+            </w:pPr>
+            <w:r>
+              <w:t xml:space="preserve">number</w:t>
+            </w:r>
+          </w:p>
+        </w:tc>
+        <w:tc>
+          <w:tcPr>
+            <w:tcW w:type="dxa" w:w="4320"/>
+            <w:gridSpan w:val="1"/>
+            <w:tcBorders>
+              <w:top w:val="none" w:color="auto" w:sz="0"/>
+              <w:left w:val="none" w:color="auto" w:sz="0"/>
+              <w:bottom w:val="single" w:color="EEF2F7" w:sz="4"/>
+              <w:right w:val="none" w:color="auto" w:sz="0"/>
+            </w:tcBorders>
+            <w:tcMar>
+              <w:top w:type="dxa" w:w="105"/>
+              <w:left w:type="dxa" w:w="158"/>
+              <w:bottom w:type="dxa" w:w="105"/>
+              <w:right w:type="dxa" w:w="158"/>
+            </w:tcMar>
+            <w:vAlign w:val="top"/>
+          </w:tcPr>
+          <w:p>
+            <w:pPr>
+              <w:pStyle w:val="CudocTableCell"/>
+              <w:overflowPunct/>
+              <w:autoSpaceDN/>
+            </w:pPr>
+            <w:r>
+              <w:t xml:space="preserve">Ten-minute mean wind speed; gusts are in </w:t>
+            </w:r>
+            <w:r>
+              <w:rPr>
+                <w:rStyle w:val="CudocCode"/>
+              </w:rPr>
+              <w:t xml:space="preserve">windGust</w:t>
+            </w:r>
+            <w:r>
+              <w:t xml:space="preserve"> when the station has it.</w:t>
+            </w:r>
+          </w:p>
+        </w:tc>
+      </w:tr>
+      <w:tr>
+        <w:trPr>
+          <w:cantSplit/>
+          <w:tblHeader w:val="false"/>
+        </w:trPr>
+        <w:tc>
+          <w:tcPr>
+            <w:tcW w:type="dxa" w:w="2659"/>
+            <w:gridSpan w:val="1"/>
+            <w:tcBorders>
+              <w:top w:val="none" w:color="auto" w:sz="0"/>
+              <w:left w:val="none" w:color="auto" w:sz="0"/>
+              <w:bottom w:val="single" w:color="EEF2F7" w:sz="4"/>
+              <w:right w:val="none" w:color="auto" w:sz="0"/>
+            </w:tcBorders>
+            <w:shd w:fill="FAFBFD" w:val="clear"/>
+            <w:tcMar>
+              <w:top w:type="dxa" w:w="105"/>
+              <w:left w:type="dxa" w:w="158"/>
+              <w:bottom w:type="dxa" w:w="105"/>
+              <w:right w:type="dxa" w:w="158"/>
+            </w:tcMar>
+            <w:vAlign w:val="top"/>
+          </w:tcPr>
+          <w:p>
+            <w:pPr>
+              <w:pStyle w:val="CudocTableCell"/>
+              <w:overflowPunct/>
+              <w:autoSpaceDN/>
+            </w:pPr>
+            <w:r>
+              <w:rPr>
+                <w:rStyle w:val="CudocCode"/>
+              </w:rPr>
+              <w:t xml:space="preserve">windDirection</w:t>
+            </w:r>
+          </w:p>
+        </w:tc>
+        <w:tc>
+          <w:tcPr>
+            <w:tcW w:type="dxa" w:w="2659"/>
+            <w:gridSpan w:val="1"/>
+            <w:tcBorders>
+              <w:top w:val="none" w:color="auto" w:sz="0"/>
+              <w:left w:val="none" w:color="auto" w:sz="0"/>
+              <w:bottom w:val="single" w:color="EEF2F7" w:sz="4"/>
+              <w:right w:val="none" w:color="auto" w:sz="0"/>
+            </w:tcBorders>
+            <w:shd w:fill="FAFBFD" w:val="clear"/>
+            <w:tcMar>
+              <w:top w:type="dxa" w:w="105"/>
+              <w:left w:type="dxa" w:w="158"/>
+              <w:bottom w:type="dxa" w:w="105"/>
+              <w:right w:type="dxa" w:w="158"/>
+            </w:tcMar>
+            <w:vAlign w:val="top"/>
+          </w:tcPr>
+          <w:p>
+            <w:pPr>
+              <w:pStyle w:val="CudocTableCell"/>
+              <w:overflowPunct/>
+              <w:autoSpaceDN/>
+            </w:pPr>
+            <w:r>
+              <w:t xml:space="preserve">integer</w:t>
+            </w:r>
+          </w:p>
+        </w:tc>
+        <w:tc>
+          <w:tcPr>
+            <w:tcW w:type="dxa" w:w="4320"/>
+            <w:gridSpan w:val="1"/>
+            <w:tcBorders>
+              <w:top w:val="none" w:color="auto" w:sz="0"/>
+              <w:left w:val="none" w:color="auto" w:sz="0"/>
+              <w:bottom w:val="single" w:color="EEF2F7" w:sz="4"/>
+              <w:right w:val="none" w:color="auto" w:sz="0"/>
+            </w:tcBorders>
+            <w:shd w:fill="FAFBFD" w:val="clear"/>
+            <w:tcMar>
+              <w:top w:type="dxa" w:w="105"/>
+              <w:left w:type="dxa" w:w="158"/>
+              <w:bottom w:type="dxa" w:w="105"/>
+              <w:right w:type="dxa" w:w="158"/>
+            </w:tcMar>
+            <w:vAlign w:val="top"/>
+          </w:tcPr>
+          <w:p>
+            <w:pPr>
+              <w:pStyle w:val="CudocTableCell"/>
+              <w:overflowPunct/>
+              <w:autoSpaceDN/>
+            </w:pPr>
+            <w:r>
+              <w:t xml:space="preserve">Degrees clockwise from north, the direction the wind comes from.</w:t>
+            </w:r>
+          </w:p>
+        </w:tc>
+      </w:tr>
+      <w:tr>
+        <w:trPr>
+          <w:cantSplit/>
+          <w:tblHeader w:val="false"/>
+        </w:trPr>
+        <w:tc>
+          <w:tcPr>
+            <w:tcW w:type="dxa" w:w="2659"/>
+            <w:gridSpan w:val="1"/>
+            <w:tcBorders>
+              <w:top w:val="none" w:color="auto" w:sz="0"/>
+              <w:left w:val="none" w:color="auto" w:sz="0"/>
+              <w:bottom w:val="single" w:color="EEF2F7" w:sz="4"/>
+              <w:right w:val="none" w:color="auto" w:sz="0"/>
+            </w:tcBorders>
+            <w:tcMar>
+              <w:top w:type="dxa" w:w="105"/>
+              <w:left w:type="dxa" w:w="158"/>
+              <w:bottom w:type="dxa" w:w="105"/>
+              <w:right w:type="dxa" w:w="158"/>
+            </w:tcMar>
+            <w:vAlign w:val="top"/>
+          </w:tcPr>
+          <w:p>
+            <w:pPr>
+              <w:pStyle w:val="CudocTableCell"/>
+              <w:overflowPunct/>
+              <w:autoSpaceDN/>
+            </w:pPr>
+            <w:r>
+              <w:rPr>
+                <w:rStyle w:val="CudocCode"/>
+              </w:rPr>
+              <w:t xml:space="preserve">conditions</w:t>
+            </w:r>
+          </w:p>
+        </w:tc>
+        <w:tc>
+          <w:tcPr>
+            <w:tcW w:type="dxa" w:w="2659"/>
+            <w:gridSpan w:val="1"/>
+            <w:tcBorders>
+              <w:top w:val="none" w:color="auto" w:sz="0"/>
+              <w:left w:val="none" w:color="auto" w:sz="0"/>
+              <w:bottom w:val="single" w:color="EEF2F7" w:sz="4"/>
+              <w:right w:val="none" w:color="auto" w:sz="0"/>
+            </w:tcBorders>
+            <w:tcMar>
+              <w:top w:type="dxa" w:w="105"/>
+              <w:left w:type="dxa" w:w="158"/>
+              <w:bottom w:type="dxa" w:w="105"/>
+              <w:right w:type="dxa" w:w="158"/>
+            </w:tcMar>
+            <w:vAlign w:val="top"/>
+          </w:tcPr>
+          <w:p>
+            <w:pPr>
+              <w:pStyle w:val="CudocTableCell"/>
+              <w:overflowPunct/>
+              <w:autoSpaceDN/>
+            </w:pPr>
+            <w:r>
+              <w:t xml:space="preserve">string</w:t>
+            </w:r>
+          </w:p>
+        </w:tc>
+        <w:tc>
+          <w:tcPr>
+            <w:tcW w:type="dxa" w:w="4320"/>
+            <w:gridSpan w:val="1"/>
+            <w:tcBorders>
+              <w:top w:val="none" w:color="auto" w:sz="0"/>
+              <w:left w:val="none" w:color="auto" w:sz="0"/>
+              <w:bottom w:val="single" w:color="EEF2F7" w:sz="4"/>
+              <w:right w:val="none" w:color="auto" w:sz="0"/>
+            </w:tcBorders>
+            <w:tcMar>
+              <w:top w:type="dxa" w:w="105"/>
+              <w:left w:type="dxa" w:w="158"/>
+              <w:bottom w:type="dxa" w:w="105"/>
+              <w:right w:type="dxa" w:w="158"/>
+            </w:tcMar>
+            <w:vAlign w:val="top"/>
+          </w:tcPr>
+          <w:p>
+            <w:pPr>
+              <w:pStyle w:val="CudocTableCell"/>
+              <w:overflowPunct/>
+              <w:autoSpaceDN/>
+            </w:pPr>
+            <w:r>
+              <w:t xml:space="preserve">One of </w:t>
+            </w:r>
+            <w:r>
+              <w:rPr>
+                <w:rStyle w:val="CudocCode"/>
+              </w:rPr>
+              <w:t xml:space="preserve">clear</w:t>
+            </w:r>
+            <w:r>
+              <w:t xml:space="preserve">, </w:t>
+            </w:r>
+            <w:r>
+              <w:rPr>
+                <w:rStyle w:val="CudocCode"/>
+              </w:rPr>
+              <w:t xml:space="preserve">partly-cloudy</w:t>
+            </w:r>
+            <w:r>
+              <w:t xml:space="preserve">, </w:t>
+            </w:r>
+            <w:r>
+              <w:rPr>
+                <w:rStyle w:val="CudocCode"/>
+              </w:rPr>
+              <w:t xml:space="preserve">overcast</w:t>
+            </w:r>
+            <w:r>
+              <w:t xml:space="preserve">, </w:t>
+            </w:r>
+            <w:r>
+              <w:rPr>
+                <w:rStyle w:val="CudocCode"/>
+              </w:rPr>
+              <w:t xml:space="preserve">fog</w:t>
+            </w:r>
+            <w:r>
+              <w:t xml:space="preserve">, </w:t>
+            </w:r>
+            <w:r>
+              <w:rPr>
+                <w:rStyle w:val="CudocCode"/>
+              </w:rPr>
+              <w:t xml:space="preserve">rain</w:t>
+            </w:r>
+            <w:r>
+              <w:t xml:space="preserve">, </w:t>
+            </w:r>
+            <w:r>
+              <w:rPr>
+                <w:rStyle w:val="CudocCode"/>
+              </w:rPr>
+              <w:t xml:space="preserve">snow</w:t>
+            </w:r>
+            <w:r>
+              <w:t xml:space="preserve">, </w:t>
+            </w:r>
+            <w:r>
+              <w:rPr>
+                <w:rStyle w:val="CudocCode"/>
+              </w:rPr>
+              <w:t xml:space="preserve">sleet</w:t>
+            </w:r>
+            <w:r>
+              <w:t xml:space="preserve">.</w:t>
+            </w:r>
+          </w:p>
+        </w:tc>
+      </w:tr>
+      <w:tr>
+        <w:trPr>
+          <w:cantSplit/>
+          <w:tblHeader w:val="false"/>
+        </w:trPr>
+        <w:tc>
+          <w:tcPr>
+            <w:tcW w:type="dxa" w:w="2659"/>
+            <w:gridSpan w:val="1"/>
+            <w:tcBorders>
+              <w:top w:val="none" w:color="auto" w:sz="0"/>
+              <w:left w:val="none" w:color="auto" w:sz="0"/>
+              <w:bottom w:val="none" w:color="auto" w:sz="0"/>
+              <w:right w:val="none" w:color="auto" w:sz="0"/>
+            </w:tcBorders>
+            <w:shd w:fill="FAFBFD" w:val="clear"/>
+            <w:tcMar>
+              <w:top w:type="dxa" w:w="105"/>
+              <w:left w:type="dxa" w:w="158"/>
+              <w:bottom w:type="dxa" w:w="105"/>
+              <w:right w:type="dxa" w:w="158"/>
+            </w:tcMar>
+            <w:vAlign w:val="top"/>
+          </w:tcPr>
+          <w:p>
+            <w:pPr>
+              <w:pStyle w:val="CudocTableCell"/>
+              <w:overflowPunct/>
+              <w:autoSpaceDN/>
+            </w:pPr>
+            <w:r>
+              <w:rPr>
+                <w:rStyle w:val="CudocCode"/>
+              </w:rPr>
+              <w:t xml:space="preserve">stale</w:t>
+            </w:r>
+          </w:p>
+        </w:tc>
+        <w:tc>
+          <w:tcPr>
+            <w:tcW w:type="dxa" w:w="2659"/>
+            <w:gridSpan w:val="1"/>
+            <w:tcBorders>
+              <w:top w:val="none" w:color="auto" w:sz="0"/>
+              <w:left w:val="none" w:color="auto" w:sz="0"/>
+              <w:bottom w:val="none" w:color="auto" w:sz="0"/>
+              <w:right w:val="none" w:color="auto" w:sz="0"/>
+            </w:tcBorders>
+            <w:shd w:fill="FAFBFD" w:val="clear"/>
+            <w:tcMar>
+              <w:top w:type="dxa" w:w="105"/>
+              <w:left w:type="dxa" w:w="158"/>
+              <w:bottom w:type="dxa" w:w="105"/>
+              <w:right w:type="dxa" w:w="158"/>
+            </w:tcMar>
+            <w:vAlign w:val="top"/>
+          </w:tcPr>
+          <w:p>
+            <w:pPr>
+              <w:pStyle w:val="CudocTableCell"/>
+              <w:overflowPunct/>
+              <w:autoSpaceDN/>
+            </w:pPr>
+            <w:r>
+              <w:t xml:space="preserve">boolean</w:t>
+            </w:r>
+          </w:p>
+        </w:tc>
+        <w:tc>
+          <w:tcPr>
+            <w:tcW w:type="dxa" w:w="4320"/>
+            <w:gridSpan w:val="1"/>
+            <w:tcBorders>
+              <w:top w:val="none" w:color="auto" w:sz="0"/>
+              <w:left w:val="none" w:color="auto" w:sz="0"/>
+              <w:bottom w:val="none" w:color="auto" w:sz="0"/>
+              <w:right w:val="none" w:color="auto" w:sz="0"/>
+            </w:tcBorders>
+            <w:shd w:fill="FAFBFD" w:val="clear"/>
+            <w:tcMar>
+              <w:top w:type="dxa" w:w="105"/>
+              <w:left w:type="dxa" w:w="158"/>
+              <w:bottom w:type="dxa" w:w="105"/>
+              <w:right w:type="dxa" w:w="158"/>
+            </w:tcMar>
+            <w:vAlign w:val="top"/>
+          </w:tcPr>
+          <w:p>
+            <w:pPr>
+              <w:pStyle w:val="CudocTableCell"/>
+              <w:overflowPunct/>
+              <w:autoSpaceDN/>
+            </w:pPr>
+            <w:r>
+              <w:rPr>
+                <w:rStyle w:val="CudocCode"/>
+              </w:rPr>
+              <w:t xml:space="preserve">true</w:t>
+            </w:r>
+            <w:r>
+              <w:t xml:space="preserve"> when the reading is older than fifteen minutes.</w:t>
+            </w:r>
+          </w:p>
+        </w:tc>
+      </w:tr>
+    </w:tbl>
+    <w:p>
+      <w:pPr>
+        <w:pStyle w:val="CudocBody"/>
+        <w:overflowPunct/>
+        <w:spacing w:before="210"/>
+        <w:autoSpaceDN/>
+      </w:pPr>
+      <w:r>
+        <w:t xml:space="preserve">A missing station returns </w:t>
+      </w:r>
+      <w:r>
+        <w:rPr>
+          <w:rStyle w:val="CudocCode"/>
+        </w:rPr>
         <w:t xml:space="preserve">404</w:t>
       </w:r>
       <w:r>
@@ -757,27 +3017,170 @@
       <w:r>
         <w:t xml:space="preserve">, listed under </w:t>
       </w:r>
-      <w:hyperlink w:history="1" r:id="rIdg_22ihiecnvvn4zu-sehg">
+      <w:hyperlink w:history="1" r:id="rId2m_k1w8kxucvyk_hnsizj">
         <w:r>
           <w:t xml:space="preserve">Error codes</w:t>
         </w:r>
       </w:hyperlink>
       <w:r>
-        <w:t xml:space="preserve">.</w:t>
+        <w:t xml:space="preserve">. Branch on the code; the </w:t>
+      </w:r>
+      <w:r>
+        <w:rPr>
+          <w:rStyle w:val="CudocCode"/>
+        </w:rPr>
+        <w:t xml:space="preserve">message</w:t>
+      </w:r>
+      <w:r>
+        <w:t xml:space="preserve"> is for humans and may change between releases.</w:t>
+      </w:r>
+    </w:p>
+    <w:p>
+      <w:pPr>
+        <w:pStyle w:val="CudocBody"/>
+        <w:overflowPunct/>
+        <w:autoSpaceDN/>
+      </w:pPr>
+      <w:r>
+        <w:t xml:space="preserve">Two response headers matter from the first request on. </w:t>
+      </w:r>
+      <w:r>
+        <w:rPr>
+          <w:rStyle w:val="CudocCode"/>
+        </w:rPr>
+        <w:t xml:space="preserve">X-Limit-Minute</w:t>
+      </w:r>
+      <w:r>
+        <w:t xml:space="preserve"> and </w:t>
+      </w:r>
+      <w:r>
+        <w:rPr>
+          <w:rStyle w:val="CudocCode"/>
+        </w:rPr>
+        <w:t xml:space="preserve">X-Limit-Hour</w:t>
+      </w:r>
+      <w:r>
+        <w:t xml:space="preserve"> report how many requests remain in the current windows, and </w:t>
+      </w:r>
+      <w:r>
+        <w:rPr>
+          <w:rStyle w:val="CudocCode"/>
+        </w:rPr>
+        <w:t xml:space="preserve">ETag</w:t>
+      </w:r>
+      <w:r>
+        <w:t xml:space="preserve"> identifies the reading, so a later request can send </w:t>
+      </w:r>
+      <w:r>
+        <w:rPr>
+          <w:rStyle w:val="CudocCode"/>
+        </w:rPr>
+        <w:t xml:space="preserve">If-None-Match</w:t>
+      </w:r>
+      <w:r>
+        <w:t xml:space="preserve"> and receive a </w:t>
+      </w:r>
+      <w:r>
+        <w:rPr>
+          <w:rStyle w:val="CudocCode"/>
+        </w:rPr>
+        <w:t xml:space="preserve">304</w:t>
+      </w:r>
+      <w:r>
+        <w:t xml:space="preserve"> that does not count against any window:</w:t>
+      </w:r>
+    </w:p>
+    <w:p>
+      <w:pPr>
+        <w:pStyle w:val="CudocCodeBlock"/>
+        <w:overflowPunct/>
+        <w:spacing w:after="0" w:before="210"/>
+        <w:autoSpaceDN/>
+      </w:pPr>
+      <w:r>
+        <w:rPr>
+          <w:rStyle w:val="CudocCodeKeyword"/>
+        </w:rPr>
+        <w:t xml:space="preserve">GET</w:t>
+      </w:r>
+      <w:r>
+        <w:t xml:space="preserve"> </w:t>
+      </w:r>
+      <w:r>
+        <w:rPr>
+          <w:rStyle w:val="CudocCodeString"/>
+        </w:rPr>
+        <w:t xml:space="preserve">/v1/weather/current?station=OSL-01</w:t>
+      </w:r>
+      <w:r>
+        <w:t xml:space="preserve"> </w:t>
+      </w:r>
+      <w:r>
+        <w:t xml:space="preserve">HTTP/1.1</w:t>
+      </w:r>
+    </w:p>
+    <w:p>
+      <w:pPr>
+        <w:pStyle w:val="CudocCodeBlock"/>
+        <w:overflowPunct/>
+        <w:spacing w:after="0" w:before="0"/>
+        <w:autoSpaceDN/>
+      </w:pPr>
+      <w:r>
+        <w:t xml:space="preserve">Host</w:t>
+      </w:r>
+      <w:r>
+        <w:t xml:space="preserve">: </w:t>
+      </w:r>
+      <w:r>
+        <w:t xml:space="preserve">api.northlight.example</w:t>
+      </w:r>
+    </w:p>
+    <w:p>
+      <w:pPr>
+        <w:pStyle w:val="CudocCodeBlock"/>
+        <w:overflowPunct/>
+        <w:spacing w:after="0" w:before="0"/>
+        <w:autoSpaceDN/>
+      </w:pPr>
+      <w:r>
+        <w:t xml:space="preserve">Authorization</w:t>
+      </w:r>
+      <w:r>
+        <w:t xml:space="preserve">: </w:t>
+      </w:r>
+      <w:r>
+        <w:t xml:space="preserve">Bearer nlk_live_…</w:t>
+      </w:r>
+    </w:p>
+    <w:p>
+      <w:pPr>
+        <w:pStyle w:val="CudocCodeBlock"/>
+        <w:overflowPunct/>
+        <w:spacing w:after="210" w:before="0"/>
+        <w:autoSpaceDN/>
+      </w:pPr>
+      <w:r>
+        <w:t xml:space="preserve">If-None-Match</w:t>
+      </w:r>
+      <w:r>
+        <w:t xml:space="preserve">: </w:t>
+      </w:r>
+      <w:r>
+        <w:t xml:space="preserve">"obs-OSL-01-1758520800"</w:t>
       </w:r>
     </w:p>
     <w:p>
       <w:pPr>
         <w:pStyle w:val="Heading2"/>
-        <w:pageBreakBefore/>
-        <w:overflowPunct/>
-        <w:autoSpaceDN/>
-      </w:pPr>
-      <w:bookmarkStart w:name="cudocqzklZqtrTkO3CKfQ3eN93HIIud" w:id="6"/>
+        <w:overflowPunct/>
+        <w:autoSpaceDN/>
+      </w:pPr>
+      <w:bookmarkStart w:name="cudocqzklZqtrTkO3CKfQ3eN93HIIud" w:id="7"/>
       <w:r>
         <w:t xml:space="preserve">Stay within the limits</w:t>
       </w:r>
-      <w:bookmarkEnd w:id="6"/>
+      <w:bookmarkEnd w:id="7"/>
     </w:p>
     <w:p>
       <w:pPr>
@@ -788,7 +3191,7 @@
       <w:r>
         <w:t xml:space="preserve">Current conditions are cached at the edge for sixty seconds, so polling faster than that returns the same reading and spends your quota. The windows and the headers that report them are in </w:t>
       </w:r>
-      <w:hyperlink w:history="1" r:id="rIdn05nxfmpmkskf3n94p_1r">
+      <w:hyperlink w:history="1" r:id="rIdhrnejeygqutvdzk03xdpx">
         <w:r>
           <w:t xml:space="preserve">Rate limits</w:t>
         </w:r>
@@ -800,15 +3203,14 @@
     <w:p>
       <w:pPr>
         <w:pStyle w:val="Heading2"/>
-        <w:pageBreakBefore/>
-        <w:overflowPunct/>
-        <w:autoSpaceDN/>
-      </w:pPr>
-      <w:bookmarkStart w:name="cudocJ9oX8xGOEmNeEhr6SYKudSgrY8" w:id="7"/>
+        <w:overflowPunct/>
+        <w:autoSpaceDN/>
+      </w:pPr>
+      <w:bookmarkStart w:name="cudocJ9oX8xGOEmNeEhr6SYKudSgrY8" w:id="8"/>
       <w:r>
         <w:t xml:space="preserve">Windows</w:t>
       </w:r>
-      <w:bookmarkEnd w:id="7"/>
+      <w:bookmarkEnd w:id="8"/>
     </w:p>
     <w:p>
       <w:pPr>
@@ -817,7 +3219,7 @@
         <w:autoSpaceDN/>
       </w:pPr>
       <w:r>
-        <w:t xml:space="preserve">As a new integrator you share one rule: a key may make 60 requests per rolling minute to </w:t>
+        <w:t xml:space="preserve">As a new integrator you share one rule: a key has a rolling minute window on </w:t>
       </w:r>
       <w:r>
         <w:rPr>
@@ -826,7 +3228,16 @@
         <w:t xml:space="preserve">/v1/weather/current</w:t>
       </w:r>
       <w:r>
-        <w:t xml:space="preserve"> and 600 per rolling hour across all endpoints. Both counters are reported on every response.</w:t>
+        <w:t xml:space="preserve"> and a rolling hour window across all endpoints, the size of each depends on the plan, and both counters are reported on every response. A request that finds either window empty is answered with </w:t>
+      </w:r>
+      <w:r>
+        <w:rPr>
+          <w:rStyle w:val="CudocCode"/>
+        </w:rPr>
+        <w:t xml:space="preserve">429 rate_limited</w:t>
+      </w:r>
+      <w:r>
+        <w:t xml:space="preserve"> and is not counted.</w:t>
       </w:r>
     </w:p>
     <w:tbl>
@@ -1124,9 +3535,169 @@
     </w:tbl>
     <w:p>
       <w:pPr>
-        <w:pStyle w:val="CudocSpacer"/>
-        <w:spacing w:after="0" w:before="210" w:line="240"/>
-      </w:pPr>
+        <w:pStyle w:val="CudocBody"/>
+        <w:overflowPunct/>
+        <w:spacing w:before="210"/>
+        <w:autoSpaceDN/>
+      </w:pPr>
+      <w:r>
+        <w:t xml:space="preserve">Windows are rolling, not aligned to the clock: a request made at 12:00:30 leaves the minute window at 12:01:30. A </w:t>
+      </w:r>
+      <w:r>
+        <w:rPr>
+          <w:rStyle w:val="CudocCode"/>
+        </w:rPr>
+        <w:t xml:space="preserve">304</w:t>
+      </w:r>
+      <w:r>
+        <w:t xml:space="preserve"> answer to a conditional request counts against neither window, and neither does a </w:t>
+      </w:r>
+      <w:r>
+        <w:rPr>
+          <w:rStyle w:val="CudocCode"/>
+        </w:rPr>
+        <w:t xml:space="preserve">429</w:t>
+      </w:r>
+      <w:r>
+        <w:t xml:space="preserve"> or a </w:t>
+      </w:r>
+      <w:r>
+        <w:rPr>
+          <w:rStyle w:val="CudocCode"/>
+        </w:rPr>
+        <w:t xml:space="preserve">5xx</w:t>
+      </w:r>
+      <w:r>
+        <w:t xml:space="preserve">.</w:t>
+      </w:r>
+    </w:p>
+    <w:p>
+      <w:pPr>
+        <w:pStyle w:val="CudocBody"/>
+        <w:overflowPunct/>
+        <w:autoSpaceDN/>
+      </w:pPr>
+      <w:r>
+        <w:t xml:space="preserve">A schedule that works for most services:</w:t>
+      </w:r>
+    </w:p>
+    <w:p>
+      <w:pPr>
+        <w:pStyle w:val="CudocListItem"/>
+        <w:numPr>
+          <w:ilvl w:val="0"/>
+          <w:numId w:val="6"/>
+        </w:numPr>
+        <w:overflowPunct/>
+        <w:autoSpaceDN/>
+      </w:pPr>
+      <w:r>
+        <w:t xml:space="preserve">Poll </w:t>
+      </w:r>
+      <w:r>
+        <w:rPr>
+          <w:rStyle w:val="CudocCode"/>
+        </w:rPr>
+        <w:t xml:space="preserve">/v1/weather/current</w:t>
+      </w:r>
+      <w:r>
+        <w:t xml:space="preserve"> once a minute per station, offset by a few seconds per station so the requests do not all land at once.</w:t>
+      </w:r>
+    </w:p>
+    <w:p>
+      <w:pPr>
+        <w:pStyle w:val="CudocListItem"/>
+        <w:numPr>
+          <w:ilvl w:val="0"/>
+          <w:numId w:val="6"/>
+        </w:numPr>
+        <w:overflowPunct/>
+        <w:autoSpaceDN/>
+      </w:pPr>
+      <w:r>
+        <w:t xml:space="preserve">Fetch the hourly forecast once an hour, shortly after the model run lands at five past the hour.</w:t>
+      </w:r>
+    </w:p>
+    <w:p>
+      <w:pPr>
+        <w:pStyle w:val="CudocListItem"/>
+        <w:numPr>
+          <w:ilvl w:val="0"/>
+          <w:numId w:val="6"/>
+        </w:numPr>
+        <w:overflowPunct/>
+        <w:autoSpaceDN/>
+      </w:pPr>
+      <w:r>
+        <w:t xml:space="preserve">Send </w:t>
+      </w:r>
+      <w:r>
+        <w:rPr>
+          <w:rStyle w:val="CudocCode"/>
+        </w:rPr>
+        <w:t xml:space="preserve">If-None-Match</w:t>
+      </w:r>
+      <w:r>
+        <w:t xml:space="preserve"> on every poll and treat a </w:t>
+      </w:r>
+      <w:r>
+        <w:rPr>
+          <w:rStyle w:val="CudocCode"/>
+        </w:rPr>
+        <w:t xml:space="preserve">304</w:t>
+      </w:r>
+      <w:r>
+        <w:t xml:space="preserve"> as "nothing new".</w:t>
+      </w:r>
+    </w:p>
+    <w:p>
+      <w:pPr>
+        <w:pStyle w:val="CudocListItem"/>
+        <w:numPr>
+          <w:ilvl w:val="0"/>
+          <w:numId w:val="6"/>
+        </w:numPr>
+        <w:overflowPunct/>
+        <w:autoSpaceDN/>
+      </w:pPr>
+      <w:r>
+        <w:t xml:space="preserve">On a </w:t>
+      </w:r>
+      <w:r>
+        <w:rPr>
+          <w:rStyle w:val="CudocCode"/>
+        </w:rPr>
+        <w:t xml:space="preserve">429</w:t>
+      </w:r>
+      <w:r>
+        <w:t xml:space="preserve">, wait for </w:t>
+      </w:r>
+      <w:r>
+        <w:rPr>
+          <w:rStyle w:val="CudocCode"/>
+        </w:rPr>
+        <w:t xml:space="preserve">Retry-After</w:t>
+      </w:r>
+      <w:r>
+        <w:t xml:space="preserve">; on a </w:t>
+      </w:r>
+      <w:r>
+        <w:rPr>
+          <w:rStyle w:val="CudocCode"/>
+        </w:rPr>
+        <w:t xml:space="preserve">503</w:t>
+      </w:r>
+      <w:r>
+        <w:t xml:space="preserve">, back off as described in </w:t>
+      </w:r>
+      <w:hyperlink w:history="1" r:id="rIdhe14icyn6meqsziu7kem9">
+        <w:r>
+          <w:t xml:space="preserve">Backoff</w:t>
+        </w:r>
+      </w:hyperlink>
+      <w:r>
+        <w:t xml:space="preserve">.</w:t>
+      </w:r>
     </w:p>
     <w:p>
       <w:pPr>
@@ -1145,7 +3716,171 @@
         <w:autoSpaceDN/>
       </w:pPr>
       <w:r>
-        <w:t xml:space="preserve">Two services sharing one key share one window. Give each service its own key so a spike in one cannot starve the other.</w:t>
+        <w:t xml:space="preserve">Two services sharing one key share one window. Give each service its own key so a spike in one cannot starve the other, and so a leaked key can be revoked without stopping everything else.</w:t>
+      </w:r>
+    </w:p>
+    <w:p>
+      <w:pPr>
+        <w:pStyle w:val="Heading2"/>
+        <w:overflowPunct/>
+        <w:autoSpaceDN/>
+      </w:pPr>
+      <w:bookmarkStart w:name="cudoczipnxB4jojYmAxFYebWzXByKSF" w:id="9"/>
+      <w:r>
+        <w:t xml:space="preserve">Go to production</w:t>
+      </w:r>
+      <w:bookmarkEnd w:id="9"/>
+    </w:p>
+    <w:p>
+      <w:pPr>
+        <w:pStyle w:val="CudocBody"/>
+        <w:overflowPunct/>
+        <w:autoSpaceDN/>
+      </w:pPr>
+      <w:r>
+        <w:t xml:space="preserve">Before switching from the test key to a live one, check that your client:</w:t>
+      </w:r>
+    </w:p>
+    <w:p>
+      <w:pPr>
+        <w:pStyle w:val="CudocListItem"/>
+        <w:numPr>
+          <w:ilvl w:val="0"/>
+          <w:numId w:val="7"/>
+        </w:numPr>
+        <w:overflowPunct/>
+        <w:autoSpaceDN/>
+      </w:pPr>
+      <w:r>
+        <w:t xml:space="preserve">reads </w:t>
+      </w:r>
+      <w:r>
+        <w:rPr>
+          <w:rStyle w:val="CudocCode"/>
+        </w:rPr>
+        <w:t xml:space="preserve">units</w:t>
+      </w:r>
+      <w:r>
+        <w:t xml:space="preserve"> instead of assuming metric;</w:t>
+      </w:r>
+    </w:p>
+    <w:p>
+      <w:pPr>
+        <w:pStyle w:val="CudocListItem"/>
+        <w:numPr>
+          <w:ilvl w:val="0"/>
+          <w:numId w:val="7"/>
+        </w:numPr>
+        <w:overflowPunct/>
+        <w:autoSpaceDN/>
+      </w:pPr>
+      <w:r>
+        <w:t xml:space="preserve">treats </w:t>
+      </w:r>
+      <w:r>
+        <w:rPr>
+          <w:rStyle w:val="CudocCode"/>
+        </w:rPr>
+        <w:t xml:space="preserve">stale: true</w:t>
+      </w:r>
+      <w:r>
+        <w:t xml:space="preserve"> as a reason to show the reading's age, not to drop it;</w:t>
+      </w:r>
+    </w:p>
+    <w:p>
+      <w:pPr>
+        <w:pStyle w:val="CudocListItem"/>
+        <w:numPr>
+          <w:ilvl w:val="0"/>
+          <w:numId w:val="7"/>
+        </w:numPr>
+        <w:overflowPunct/>
+        <w:autoSpaceDN/>
+      </w:pPr>
+      <w:r>
+        <w:t xml:space="preserve">handles every code in </w:t>
+      </w:r>
+      <w:hyperlink w:history="1" r:id="rIdsm-hopqgxcna6kwxkmjfb">
+        <w:r>
+          <w:t xml:space="preserve">Error codes</w:t>
+        </w:r>
+      </w:hyperlink>
+      <w:r>
+        <w:t xml:space="preserve">, including </w:t>
+      </w:r>
+      <w:r>
+        <w:rPr>
+          <w:rStyle w:val="CudocCode"/>
+        </w:rPr>
+        <w:t xml:space="preserve">station_retired</w:t>
+      </w:r>
+      <w:r>
+        <w:t xml:space="preserve">, which arrives one day for any long-running client;</w:t>
+      </w:r>
+    </w:p>
+    <w:p>
+      <w:pPr>
+        <w:pStyle w:val="CudocListItem"/>
+        <w:numPr>
+          <w:ilvl w:val="0"/>
+          <w:numId w:val="7"/>
+        </w:numPr>
+        <w:overflowPunct/>
+        <w:autoSpaceDN/>
+      </w:pPr>
+      <w:r>
+        <w:t xml:space="preserve">logs </w:t>
+      </w:r>
+      <w:r>
+        <w:rPr>
+          <w:rStyle w:val="CudocCode"/>
+        </w:rPr>
+        <w:t xml:space="preserve">X-Request-Id</w:t>
+      </w:r>
+      <w:r>
+        <w:t xml:space="preserve"> from every response, so support can find the request;</w:t>
+      </w:r>
+    </w:p>
+    <w:p>
+      <w:pPr>
+        <w:pStyle w:val="CudocListItem"/>
+        <w:numPr>
+          <w:ilvl w:val="0"/>
+          <w:numId w:val="7"/>
+        </w:numPr>
+        <w:overflowPunct/>
+        <w:autoSpaceDN/>
+      </w:pPr>
+      <w:r>
+        <w:t xml:space="preserve">ignores fields it does not know, since additive changes ship without notice (see </w:t>
+      </w:r>
+      <w:hyperlink w:history="1" r:id="rIdaebevltey9zgnfefmsb81">
+        <w:r>
+          <w:t xml:space="preserve">Versioning</w:t>
+        </w:r>
+      </w:hyperlink>
+      <w:r>
+        <w:t xml:space="preserve">).</w:t>
+      </w:r>
+    </w:p>
+    <w:p>
+      <w:pPr>
+        <w:pStyle w:val="CudocCalloutSuccessTitle"/>
+        <w:overflowPunct/>
+        <w:autoSpaceDN/>
+      </w:pPr>
+      <w:r>
+        <w:t xml:space="preserve">Ready for a live key</w:t>
+      </w:r>
+    </w:p>
+    <w:p>
+      <w:pPr>
+        <w:pStyle w:val="CudocCalloutSuccess"/>
+        <w:overflowPunct/>
+        <w:autoSpaceDN/>
+      </w:pPr>
+      <w:r>
+        <w:t xml:space="preserve">A client that passes the list above moves to a live key by changing one environment variable. Nothing else in the request changes between the two kinds of key.</w:t>
       </w:r>
     </w:p>
     <w:sectPr>
@@ -1294,7 +4029,15 @@
         <w:t xml:space="preserve">Z</w:t>
       </w:r>
       <w:r>
-        <w:t xml:space="preserve"> suffix. Convert at the edge of your own system, not in the data layer.</w:t>
+        <w:t xml:space="preserve"> suffix. Convert at the edge of your own system, not in the data layer; the station's IANA time zone is in its </w:t>
+      </w:r>
+      <w:hyperlink w:history="1" r:id="rIdtmab-w391crybwakcfqhx">
+        <w:r>
+          <w:t xml:space="preserve">detail record</w:t>
+        </w:r>
+      </w:hyperlink>
+      <w:r>
+        <w:t xml:space="preserve">.</w:t>
       </w:r>
     </w:p>
   </w:footnote>
@@ -1879,6 +4622,24 @@
   </w:num>
   <w:num w:numId="4">
     <w:abstractNumId w:val="4"/>
+    <w:lvlOverride w:ilvl="0">
+      <w:startOverride w:val="1"/>
+    </w:lvlOverride>
+  </w:num>
+  <w:num w:numId="5">
+    <w:abstractNumId w:val="4"/>
+    <w:lvlOverride w:ilvl="0">
+      <w:startOverride w:val="1"/>
+    </w:lvlOverride>
+  </w:num>
+  <w:num w:numId="6">
+    <w:abstractNumId w:val="3"/>
+    <w:lvlOverride w:ilvl="0">
+      <w:startOverride w:val="1"/>
+    </w:lvlOverride>
+  </w:num>
+  <w:num w:numId="7">
+    <w:abstractNumId w:val="2"/>
     <w:lvlOverride w:ilvl="0">
       <w:startOverride w:val="1"/>
     </w:lvlOverride>

</xml_diff>

<commit_message>
Release 0.7.0 with tree embeds
</commit_message>
<xml_diff>
--- a/examples/export/showcase-output/getting-started.docx
+++ b/examples/export/showcase-output/getting-started.docx
@@ -3017,7 +3017,7 @@
       <w:r>
         <w:t xml:space="preserve">, listed under </w:t>
       </w:r>
-      <w:hyperlink w:history="1" r:id="rIdfyzsifyhrolb5j-hwssyz">
+      <w:hyperlink w:history="1" r:id="rIdmq1atbtxs2wb6ui3t6wod">
         <w:r>
           <w:t xml:space="preserve">Error codes</w:t>
         </w:r>
@@ -3191,7 +3191,7 @@
       <w:r>
         <w:t xml:space="preserve">Current conditions are cached at the edge for sixty seconds, so polling faster than that returns the same reading and spends your quota. The windows and the headers that report them are in </w:t>
       </w:r>
-      <w:hyperlink w:history="1" r:id="rId4qrzpkejefkx2upx5fguv">
+      <w:hyperlink w:history="1" r:id="rId3zyzukohrknoc6t8rm8pm">
         <w:r>
           <w:t xml:space="preserve">Rate limits</w:t>
         </w:r>
@@ -3690,7 +3690,7 @@
       <w:r>
         <w:t xml:space="preserve">, back off as described in </w:t>
       </w:r>
-      <w:hyperlink w:history="1" r:id="rIdd30xy63xxjnp6j89hnr1u">
+      <w:hyperlink w:history="1" r:id="rIdyxqvdmqsdx9-87shyspyx">
         <w:r>
           <w:t xml:space="preserve">Backoff</w:t>
         </w:r>
@@ -3800,7 +3800,7 @@
       <w:r>
         <w:t xml:space="preserve">handles every code in </w:t>
       </w:r>
-      <w:hyperlink w:history="1" r:id="rIdqsfvyiihk_vvklpvtp0x2">
+      <w:hyperlink w:history="1" r:id="rIdc1emzzbqbrnwxdb60mtti">
         <w:r>
           <w:t xml:space="preserve">Error codes</w:t>
         </w:r>
@@ -3854,7 +3854,7 @@
       <w:r>
         <w:t xml:space="preserve">ignores fields it does not know, since additive changes ship without notice (see </w:t>
       </w:r>
-      <w:hyperlink w:history="1" r:id="rIdnngpw5mydot-bpujehu8d">
+      <w:hyperlink w:history="1" r:id="rIdptj3rwow4oqcoigegmc91">
         <w:r>
           <w:t xml:space="preserve">Versioning</w:t>
         </w:r>
@@ -4031,7 +4031,7 @@
       <w:r>
         <w:t xml:space="preserve"> suffix. Convert at the edge of your own system, not in the data layer; the station's IANA time zone is in its </w:t>
       </w:r>
-      <w:hyperlink w:history="1" r:id="rIdh5dd8kbdtheieyxfk6phh">
+      <w:hyperlink w:history="1" r:id="rIdsfeiys2qt3c-99hws22fu">
         <w:r>
           <w:t xml:space="preserve">detail record</w:t>
         </w:r>

</xml_diff>

<commit_message>
Put a mark beside the showcase title and the theme menu on the review page
The showcase stylesheet drew a striped band under the header to show a
stylesheet's url() file being copied and inlined. A small handbook mark
before the site title shows the same without marking the header. The
page to review keeps the showcase's theme menu.
</commit_message>
<xml_diff>
--- a/examples/export/showcase-output/getting-started.docx
+++ b/examples/export/showcase-output/getting-started.docx
@@ -3017,7 +3017,7 @@
       <w:r>
         <w:t xml:space="preserve">, listed under </w:t>
       </w:r>
-      <w:hyperlink w:history="1" r:id="rId9y_tzhc2qlgsv3hjrj6gf">
+      <w:hyperlink w:history="1" r:id="rIdhmkfb_avgwnqz4wnlek_f">
         <w:r>
           <w:t xml:space="preserve">Error codes</w:t>
         </w:r>
@@ -3191,7 +3191,7 @@
       <w:r>
         <w:t xml:space="preserve">Current conditions are cached at the edge for sixty seconds, so polling faster than that returns the same reading and spends your quota. The windows and the headers that report them are in </w:t>
       </w:r>
-      <w:hyperlink w:history="1" r:id="rIdgejnz5ylncj35zrgqnkxf">
+      <w:hyperlink w:history="1" r:id="rId2qcd2i2ys-dhzhizd1loo">
         <w:r>
           <w:t xml:space="preserve">Rate limits</w:t>
         </w:r>
@@ -3690,7 +3690,7 @@
       <w:r>
         <w:t xml:space="preserve">, back off as described in </w:t>
       </w:r>
-      <w:hyperlink w:history="1" r:id="rIdksm7lz_qnfw7v11mhzu7b">
+      <w:hyperlink w:history="1" r:id="rIdhlevcext23ifa2cn8ud3s">
         <w:r>
           <w:t xml:space="preserve">Backoff</w:t>
         </w:r>
@@ -3800,7 +3800,7 @@
       <w:r>
         <w:t xml:space="preserve">handles every code in </w:t>
       </w:r>
-      <w:hyperlink w:history="1" r:id="rIdupl9jlr2bb4fhb9fhadpm">
+      <w:hyperlink w:history="1" r:id="rIdn6yk-tcspcfe4caej3sms">
         <w:r>
           <w:t xml:space="preserve">Error codes</w:t>
         </w:r>
@@ -3854,7 +3854,7 @@
       <w:r>
         <w:t xml:space="preserve">ignores fields it does not know, since additive changes ship without notice (see </w:t>
       </w:r>
-      <w:hyperlink w:history="1" r:id="rIdm3yhhevi9omhaizec-b40">
+      <w:hyperlink w:history="1" r:id="rId_n-qy3yrwxzfqe2iudrw7">
         <w:r>
           <w:t xml:space="preserve">Versioning</w:t>
         </w:r>
@@ -4031,7 +4031,7 @@
       <w:r>
         <w:t xml:space="preserve"> suffix. Convert at the edge of your own system, not in the data layer; the station's IANA time zone is in its </w:t>
       </w:r>
-      <w:hyperlink w:history="1" r:id="rIdpm5ftndz-j_q4mdouqpxo">
+      <w:hyperlink w:history="1" r:id="rIdqd-1kk5talliw04au-tae">
         <w:r>
           <w:t xml:space="preserve">detail record</w:t>
         </w:r>

</xml_diff>

<commit_message>
Bump every package to 1.1.0 and rebuild the export samples
</commit_message>
<xml_diff>
--- a/examples/export/showcase-output/getting-started.docx
+++ b/examples/export/showcase-output/getting-started.docx
@@ -3017,7 +3017,7 @@
       <w:r>
         <w:t xml:space="preserve">, listed under </w:t>
       </w:r>
-      <w:hyperlink w:history="1" r:id="rId5kdwjx0567p6dfah6n5os">
+      <w:hyperlink w:history="1" r:id="rIdlh1xgc-x3rirfel2hzixy">
         <w:r>
           <w:t xml:space="preserve">Error codes</w:t>
         </w:r>
@@ -3191,7 +3191,7 @@
       <w:r>
         <w:t xml:space="preserve">Current conditions are cached at the edge for sixty seconds, so polling faster than that returns the same reading and spends your quota. The windows and the headers that report them are in </w:t>
       </w:r>
-      <w:hyperlink w:history="1" r:id="rIddyjmj0h31l6h9ab6orlfu">
+      <w:hyperlink w:history="1" r:id="rIdig2ow9h74ttrcbxxt9ghp">
         <w:r>
           <w:t xml:space="preserve">Rate limits</w:t>
         </w:r>
@@ -3690,7 +3690,7 @@
       <w:r>
         <w:t xml:space="preserve">, back off as described in </w:t>
       </w:r>
-      <w:hyperlink w:history="1" r:id="rIdnljkjldkyuhzi3z81fecb">
+      <w:hyperlink w:history="1" r:id="rId7sb3umujt-iq_hbb5enap">
         <w:r>
           <w:t xml:space="preserve">Backoff</w:t>
         </w:r>
@@ -3800,7 +3800,7 @@
       <w:r>
         <w:t xml:space="preserve">handles every code in </w:t>
       </w:r>
-      <w:hyperlink w:history="1" r:id="rIddl_5ixa9egnoxsbinkvtu">
+      <w:hyperlink w:history="1" r:id="rIdlbabb10v3nnixjdjjoatw">
         <w:r>
           <w:t xml:space="preserve">Error codes</w:t>
         </w:r>
@@ -3854,7 +3854,7 @@
       <w:r>
         <w:t xml:space="preserve">ignores fields it does not know, since additive changes ship without notice (see </w:t>
       </w:r>
-      <w:hyperlink w:history="1" r:id="rIdadekxjhmtrt32j-d3aifc">
+      <w:hyperlink w:history="1" r:id="rIdxpnri9tpz-kcz1frdxkg9">
         <w:r>
           <w:t xml:space="preserve">Versioning</w:t>
         </w:r>
@@ -4031,7 +4031,7 @@
       <w:r>
         <w:t xml:space="preserve"> suffix. Convert at the edge of your own system, not in the data layer; the station's IANA time zone is in its </w:t>
       </w:r>
-      <w:hyperlink w:history="1" r:id="rIdmu0nkouu9zap521kuzhdc">
+      <w:hyperlink w:history="1" r:id="rId1_amil-8wtg3gyofbnsnv">
         <w:r>
           <w:t xml:space="preserve">detail record</w:t>
         </w:r>

</xml_diff>